<commit_message>
Hooks and new feature Mental_Maths added
</commit_message>
<xml_diff>
--- a/Educational App.docx
+++ b/Educational App.docx
@@ -5,53 +5,106 @@
     <w:p>
       <w:pPr>
         <w:rPr>
-          <w:rFonts w:ascii="Fira Code" w:hAnsi="Fira Code" w:cs="Fira Code"/>
-          <w:lang w:val="en-GB"/>
-        </w:rPr>
-      </w:pPr>
-      <w:r>
-        <w:rPr>
-          <w:rFonts w:ascii="Fira Code" w:hAnsi="Fira Code" w:cs="Fira Code"/>
-          <w:lang w:val="en-GB"/>
-        </w:rPr>
-        <w:t>I want to build an educational app to teach maths to my son who is 11 Years old</w:t>
-      </w:r>
-      <w:r>
-        <w:rPr>
-          <w:rFonts w:ascii="Fira Code" w:hAnsi="Fira Code" w:cs="Fira Code"/>
+          <w:lang w:val="en-GB"/>
+        </w:rPr>
+      </w:pPr>
+      <w:r>
+        <w:rPr>
+          <w:lang w:val="en-GB"/>
+        </w:rPr>
+        <w:t xml:space="preserve">I want to build an educational app to teach </w:t>
+      </w:r>
+      <w:r>
+        <w:rPr>
+          <w:lang w:val="en-GB"/>
+        </w:rPr>
+        <w:t>Maths</w:t>
+      </w:r>
+      <w:r>
+        <w:rPr>
+          <w:lang w:val="en-GB"/>
+        </w:rPr>
+        <w:t xml:space="preserve"> to </w:t>
+      </w:r>
+      <w:r>
+        <w:rPr>
+          <w:lang w:val="en-GB"/>
+        </w:rPr>
+        <w:t>kids</w:t>
+      </w:r>
+      <w:r>
+        <w:rPr>
+          <w:lang w:val="en-GB"/>
+        </w:rPr>
+        <w:t xml:space="preserve"> who </w:t>
+      </w:r>
+      <w:r>
+        <w:rPr>
+          <w:lang w:val="en-GB"/>
+        </w:rPr>
+        <w:t>are</w:t>
+      </w:r>
+      <w:r>
+        <w:rPr>
+          <w:lang w:val="en-GB"/>
+        </w:rPr>
+        <w:t xml:space="preserve"> 11</w:t>
+      </w:r>
+      <w:r>
+        <w:rPr>
+          <w:lang w:val="en-GB"/>
+        </w:rPr>
+        <w:t>-12</w:t>
+      </w:r>
+      <w:r>
+        <w:rPr>
+          <w:lang w:val="en-GB"/>
+        </w:rPr>
+        <w:t xml:space="preserve"> Years old</w:t>
+      </w:r>
+      <w:r>
+        <w:rPr>
           <w:lang w:val="en-GB"/>
         </w:rPr>
         <w:t xml:space="preserve"> studying in Class 5 in India</w:t>
       </w:r>
       <w:r>
         <w:rPr>
-          <w:rFonts w:ascii="Fira Code" w:hAnsi="Fira Code" w:cs="Fira Code"/>
-          <w:lang w:val="en-GB"/>
-        </w:rPr>
-        <w:t>. I want the app to be interactive and funny to make study engaging and interesting. All complex concepts of maths should be explained using images and videos for ease of understanding.</w:t>
-      </w:r>
-    </w:p>
-    <w:p>
-      <w:pPr>
-        <w:rPr>
-          <w:rFonts w:ascii="Fira Code" w:hAnsi="Fira Code" w:cs="Fira Code"/>
-          <w:lang w:val="en-GB"/>
-        </w:rPr>
-      </w:pPr>
-    </w:p>
-    <w:p>
-      <w:pPr>
-        <w:rPr>
-          <w:rFonts w:ascii="Fira Code" w:hAnsi="Fira Code" w:cs="Fira Code"/>
-          <w:lang w:val="en-GB"/>
-        </w:rPr>
-      </w:pPr>
-      <w:r>
-        <w:rPr>
-          <w:rFonts w:ascii="Fira Code" w:hAnsi="Fira Code" w:cs="Fira Code"/>
-          <w:lang w:val="en-GB"/>
-        </w:rPr>
-        <w:t>**Topics</w:t>
+          <w:lang w:val="en-GB"/>
+        </w:rPr>
+        <w:t>. I want the app to be interactive and funny to make study engaging and interesting.</w:t>
+      </w:r>
+    </w:p>
+    <w:p>
+      <w:pPr>
+        <w:rPr>
+          <w:lang w:val="en-GB"/>
+        </w:rPr>
+      </w:pPr>
+    </w:p>
+    <w:p>
+      <w:pPr>
+        <w:rPr>
+          <w:sz w:val="28"/>
+          <w:szCs w:val="28"/>
+          <w:lang w:val="en-GB"/>
+        </w:rPr>
+      </w:pPr>
+      <w:r>
+        <w:rPr>
+          <w:sz w:val="28"/>
+          <w:szCs w:val="28"/>
+          <w:lang w:val="en-GB"/>
+        </w:rPr>
+        <w:t xml:space="preserve"># </w:t>
+      </w:r>
+      <w:r>
+        <w:rPr>
+          <w:sz w:val="28"/>
+          <w:szCs w:val="28"/>
+          <w:lang w:val="en-GB"/>
+        </w:rPr>
+        <w:t>Topics</w:t>
       </w:r>
     </w:p>
     <w:p>
@@ -62,13 +115,275 @@
           <w:numId w:val="3"/>
         </w:numPr>
         <w:rPr>
-          <w:rFonts w:ascii="Fira Code" w:hAnsi="Fira Code" w:cs="Fira Code"/>
-          <w:lang w:val="en-GB"/>
-        </w:rPr>
-      </w:pPr>
-      <w:r>
-        <w:rPr>
-          <w:rFonts w:ascii="Fira Code" w:hAnsi="Fira Code" w:cs="Fira Code"/>
+          <w:lang w:val="en-GB"/>
+        </w:rPr>
+      </w:pPr>
+      <w:r>
+        <w:rPr>
+          <w:lang w:val="en-GB"/>
+        </w:rPr>
+        <w:t>Numbers</w:t>
+      </w:r>
+    </w:p>
+    <w:p>
+      <w:pPr>
+        <w:pStyle w:val="ListParagraph"/>
+        <w:numPr>
+          <w:ilvl w:val="1"/>
+          <w:numId w:val="3"/>
+        </w:numPr>
+        <w:rPr>
+          <w:lang w:val="en-GB"/>
+        </w:rPr>
+      </w:pPr>
+      <w:r>
+        <w:rPr>
+          <w:lang w:val="en-GB"/>
+        </w:rPr>
+        <w:t>Place Value and Face Value</w:t>
+      </w:r>
+    </w:p>
+    <w:p>
+      <w:pPr>
+        <w:pStyle w:val="ListParagraph"/>
+        <w:numPr>
+          <w:ilvl w:val="1"/>
+          <w:numId w:val="3"/>
+        </w:numPr>
+        <w:rPr>
+          <w:lang w:val="en-GB"/>
+        </w:rPr>
+      </w:pPr>
+      <w:r>
+        <w:rPr>
+          <w:lang w:val="en-GB"/>
+        </w:rPr>
+        <w:t>Comparison and Ordering of Numbers</w:t>
+      </w:r>
+    </w:p>
+    <w:p>
+      <w:pPr>
+        <w:pStyle w:val="ListParagraph"/>
+        <w:numPr>
+          <w:ilvl w:val="1"/>
+          <w:numId w:val="3"/>
+        </w:numPr>
+        <w:rPr>
+          <w:lang w:val="en-GB"/>
+        </w:rPr>
+      </w:pPr>
+      <w:r>
+        <w:rPr>
+          <w:lang w:val="en-GB"/>
+        </w:rPr>
+        <w:t>Rounding off Numbers</w:t>
+      </w:r>
+    </w:p>
+    <w:p>
+      <w:pPr>
+        <w:pStyle w:val="ListParagraph"/>
+        <w:numPr>
+          <w:ilvl w:val="2"/>
+          <w:numId w:val="3"/>
+        </w:numPr>
+        <w:rPr>
+          <w:lang w:val="en-GB"/>
+        </w:rPr>
+      </w:pPr>
+      <w:r>
+        <w:rPr>
+          <w:lang w:val="en-GB"/>
+        </w:rPr>
+        <w:t>Rounding off to Nearest 10</w:t>
+      </w:r>
+    </w:p>
+    <w:p>
+      <w:pPr>
+        <w:pStyle w:val="ListParagraph"/>
+        <w:numPr>
+          <w:ilvl w:val="2"/>
+          <w:numId w:val="3"/>
+        </w:numPr>
+        <w:rPr>
+          <w:lang w:val="en-GB"/>
+        </w:rPr>
+      </w:pPr>
+      <w:r>
+        <w:rPr>
+          <w:lang w:val="en-GB"/>
+        </w:rPr>
+        <w:t>Rounding off to Nearest 10</w:t>
+      </w:r>
+      <w:r>
+        <w:rPr>
+          <w:lang w:val="en-GB"/>
+        </w:rPr>
+        <w:t>0</w:t>
+      </w:r>
+    </w:p>
+    <w:p>
+      <w:pPr>
+        <w:pStyle w:val="ListParagraph"/>
+        <w:numPr>
+          <w:ilvl w:val="2"/>
+          <w:numId w:val="3"/>
+        </w:numPr>
+        <w:rPr>
+          <w:lang w:val="en-GB"/>
+        </w:rPr>
+      </w:pPr>
+      <w:r>
+        <w:rPr>
+          <w:lang w:val="en-GB"/>
+        </w:rPr>
+        <w:t>Rounding off to Nearest 10</w:t>
+      </w:r>
+      <w:r>
+        <w:rPr>
+          <w:lang w:val="en-GB"/>
+        </w:rPr>
+        <w:t>00</w:t>
+      </w:r>
+    </w:p>
+    <w:p>
+      <w:pPr>
+        <w:pStyle w:val="ListParagraph"/>
+        <w:numPr>
+          <w:ilvl w:val="1"/>
+          <w:numId w:val="3"/>
+        </w:numPr>
+        <w:rPr>
+          <w:lang w:val="en-GB"/>
+        </w:rPr>
+      </w:pPr>
+      <w:r>
+        <w:rPr>
+          <w:lang w:val="en-GB"/>
+        </w:rPr>
+        <w:t>Quiz</w:t>
+      </w:r>
+    </w:p>
+    <w:p>
+      <w:pPr>
+        <w:pStyle w:val="ListParagraph"/>
+        <w:numPr>
+          <w:ilvl w:val="0"/>
+          <w:numId w:val="3"/>
+        </w:numPr>
+        <w:rPr>
+          <w:lang w:val="en-GB"/>
+        </w:rPr>
+      </w:pPr>
+      <w:r>
+        <w:rPr>
+          <w:lang w:val="en-GB"/>
+        </w:rPr>
+        <w:t>Operations on Large Numbers</w:t>
+      </w:r>
+    </w:p>
+    <w:p>
+      <w:pPr>
+        <w:pStyle w:val="ListParagraph"/>
+        <w:numPr>
+          <w:ilvl w:val="1"/>
+          <w:numId w:val="3"/>
+        </w:numPr>
+        <w:rPr>
+          <w:lang w:val="en-GB"/>
+        </w:rPr>
+      </w:pPr>
+      <w:r>
+        <w:rPr>
+          <w:lang w:val="en-GB"/>
+        </w:rPr>
+        <w:t>Addition of Large Numbers</w:t>
+      </w:r>
+    </w:p>
+    <w:p>
+      <w:pPr>
+        <w:pStyle w:val="ListParagraph"/>
+        <w:numPr>
+          <w:ilvl w:val="1"/>
+          <w:numId w:val="3"/>
+        </w:numPr>
+        <w:rPr>
+          <w:lang w:val="en-GB"/>
+        </w:rPr>
+      </w:pPr>
+      <w:r>
+        <w:rPr>
+          <w:lang w:val="en-GB"/>
+        </w:rPr>
+        <w:t>Subtraction of Large Numbers</w:t>
+      </w:r>
+    </w:p>
+    <w:p>
+      <w:pPr>
+        <w:pStyle w:val="ListParagraph"/>
+        <w:numPr>
+          <w:ilvl w:val="1"/>
+          <w:numId w:val="3"/>
+        </w:numPr>
+        <w:rPr>
+          <w:lang w:val="en-GB"/>
+        </w:rPr>
+      </w:pPr>
+      <w:r>
+        <w:rPr>
+          <w:lang w:val="en-GB"/>
+        </w:rPr>
+        <w:t>Multiplication of Large Numbers</w:t>
+      </w:r>
+    </w:p>
+    <w:p>
+      <w:pPr>
+        <w:pStyle w:val="ListParagraph"/>
+        <w:numPr>
+          <w:ilvl w:val="1"/>
+          <w:numId w:val="3"/>
+        </w:numPr>
+        <w:rPr>
+          <w:lang w:val="en-GB"/>
+        </w:rPr>
+      </w:pPr>
+      <w:r>
+        <w:rPr>
+          <w:lang w:val="en-GB"/>
+        </w:rPr>
+        <w:t>Multiplication using Distributive Property</w:t>
+      </w:r>
+    </w:p>
+    <w:p>
+      <w:pPr>
+        <w:pStyle w:val="ListParagraph"/>
+        <w:numPr>
+          <w:ilvl w:val="1"/>
+          <w:numId w:val="3"/>
+        </w:numPr>
+        <w:rPr>
+          <w:lang w:val="en-GB"/>
+        </w:rPr>
+      </w:pPr>
+      <w:r>
+        <w:rPr>
+          <w:lang w:val="en-GB"/>
+        </w:rPr>
+        <w:t>Division When Dividend and Divisor Both End with Zero(s)</w:t>
+      </w:r>
+    </w:p>
+    <w:p>
+      <w:pPr>
+        <w:pStyle w:val="ListParagraph"/>
+        <w:numPr>
+          <w:ilvl w:val="0"/>
+          <w:numId w:val="3"/>
+        </w:numPr>
+        <w:rPr>
+          <w:lang w:val="en-GB"/>
+        </w:rPr>
+      </w:pPr>
+      <w:r>
+        <w:rPr>
           <w:lang w:val="en-GB"/>
         </w:rPr>
         <w:t>Factors and Multiples</w:t>
@@ -78,27 +393,120 @@
       <w:pPr>
         <w:pStyle w:val="ListParagraph"/>
         <w:numPr>
+          <w:ilvl w:val="1"/>
+          <w:numId w:val="3"/>
+        </w:numPr>
+        <w:rPr>
+          <w:lang w:val="en-GB"/>
+        </w:rPr>
+      </w:pPr>
+      <w:r>
+        <w:rPr>
+          <w:lang w:val="en-GB"/>
+        </w:rPr>
+        <w:t>Tests of Divisibility</w:t>
+      </w:r>
+    </w:p>
+    <w:p>
+      <w:pPr>
+        <w:pStyle w:val="ListParagraph"/>
+        <w:numPr>
+          <w:ilvl w:val="1"/>
+          <w:numId w:val="3"/>
+        </w:numPr>
+        <w:rPr>
+          <w:lang w:val="en-GB"/>
+        </w:rPr>
+      </w:pPr>
+      <w:r>
+        <w:rPr>
+          <w:lang w:val="en-GB"/>
+        </w:rPr>
+        <w:t>Prime Number and Composite Number</w:t>
+      </w:r>
+    </w:p>
+    <w:p>
+      <w:pPr>
+        <w:pStyle w:val="ListParagraph"/>
+        <w:numPr>
+          <w:ilvl w:val="1"/>
+          <w:numId w:val="3"/>
+        </w:numPr>
+        <w:rPr>
+          <w:lang w:val="en-GB"/>
+        </w:rPr>
+      </w:pPr>
+      <w:r>
+        <w:rPr>
+          <w:lang w:val="en-GB"/>
+        </w:rPr>
+        <w:t>Co-Prime Numbers</w:t>
+      </w:r>
+    </w:p>
+    <w:p>
+      <w:pPr>
+        <w:pStyle w:val="ListParagraph"/>
+        <w:numPr>
+          <w:ilvl w:val="1"/>
+          <w:numId w:val="3"/>
+        </w:numPr>
+        <w:rPr>
+          <w:lang w:val="en-GB"/>
+        </w:rPr>
+      </w:pPr>
+      <w:r>
+        <w:rPr>
+          <w:lang w:val="en-GB"/>
+        </w:rPr>
+        <w:t>Highest Common Factor (HCF)</w:t>
+      </w:r>
+    </w:p>
+    <w:p>
+      <w:pPr>
+        <w:pStyle w:val="ListParagraph"/>
+        <w:numPr>
+          <w:ilvl w:val="1"/>
+          <w:numId w:val="3"/>
+        </w:numPr>
+        <w:rPr>
+          <w:lang w:val="en-GB"/>
+        </w:rPr>
+      </w:pPr>
+      <w:r>
+        <w:rPr>
+          <w:lang w:val="en-GB"/>
+        </w:rPr>
+        <w:t>Least Common Multiple (LCM)</w:t>
+      </w:r>
+    </w:p>
+    <w:p>
+      <w:pPr>
+        <w:pStyle w:val="ListParagraph"/>
+        <w:numPr>
           <w:ilvl w:val="0"/>
           <w:numId w:val="3"/>
         </w:numPr>
         <w:rPr>
-          <w:rFonts w:ascii="Fira Code" w:hAnsi="Fira Code" w:cs="Fira Code"/>
-          <w:lang w:val="en-GB"/>
-        </w:rPr>
-      </w:pPr>
-      <w:r>
-        <w:rPr>
-          <w:rFonts w:ascii="Fira Code" w:hAnsi="Fira Code" w:cs="Fira Code"/>
+          <w:lang w:val="en-GB"/>
+        </w:rPr>
+      </w:pPr>
+      <w:r>
+        <w:rPr>
           <w:lang w:val="en-GB"/>
         </w:rPr>
         <w:t>Fractions</w:t>
       </w:r>
       <w:r>
         <w:rPr>
-          <w:rFonts w:ascii="Fira Code" w:hAnsi="Fira Code" w:cs="Fira Code"/>
-          <w:lang w:val="en-GB"/>
-        </w:rPr>
-        <w:t xml:space="preserve"> and Operations</w:t>
+          <w:lang w:val="en-GB"/>
+        </w:rPr>
+        <w:t xml:space="preserve"> </w:t>
+      </w:r>
+      <w:r>
+        <w:rPr>
+          <w:lang w:val="en-GB"/>
+        </w:rPr>
+        <w:t>– Addition and Subtraction</w:t>
       </w:r>
     </w:p>
     <w:p>
@@ -109,23 +517,98 @@
           <w:numId w:val="3"/>
         </w:numPr>
         <w:rPr>
-          <w:rFonts w:ascii="Fira Code" w:hAnsi="Fira Code" w:cs="Fira Code"/>
-          <w:lang w:val="en-GB"/>
-        </w:rPr>
-      </w:pPr>
-      <w:r>
-        <w:rPr>
-          <w:rFonts w:ascii="Fira Code" w:hAnsi="Fira Code" w:cs="Fira Code"/>
+          <w:lang w:val="en-GB"/>
+        </w:rPr>
+      </w:pPr>
+      <w:r>
+        <w:rPr>
+          <w:lang w:val="en-GB"/>
+        </w:rPr>
+        <w:t>Fractions – Multiplication and Division</w:t>
+      </w:r>
+    </w:p>
+    <w:p>
+      <w:pPr>
+        <w:pStyle w:val="ListParagraph"/>
+        <w:numPr>
+          <w:ilvl w:val="0"/>
+          <w:numId w:val="3"/>
+        </w:numPr>
+        <w:rPr>
+          <w:lang w:val="en-GB"/>
+        </w:rPr>
+      </w:pPr>
+      <w:r>
+        <w:rPr>
           <w:lang w:val="en-GB"/>
         </w:rPr>
         <w:t>Decimal</w:t>
       </w:r>
       <w:r>
         <w:rPr>
-          <w:rFonts w:ascii="Fira Code" w:hAnsi="Fira Code" w:cs="Fira Code"/>
-          <w:lang w:val="en-GB"/>
-        </w:rPr>
-        <w:t xml:space="preserve"> System</w:t>
+          <w:lang w:val="en-GB"/>
+        </w:rPr>
+        <w:t xml:space="preserve"> </w:t>
+      </w:r>
+      <w:r>
+        <w:rPr>
+          <w:lang w:val="en-GB"/>
+        </w:rPr>
+        <w:t>Numbers</w:t>
+      </w:r>
+    </w:p>
+    <w:p>
+      <w:pPr>
+        <w:pStyle w:val="ListParagraph"/>
+        <w:numPr>
+          <w:ilvl w:val="1"/>
+          <w:numId w:val="3"/>
+        </w:numPr>
+        <w:rPr>
+          <w:lang w:val="en-GB"/>
+        </w:rPr>
+      </w:pPr>
+      <w:r>
+        <w:rPr>
+          <w:lang w:val="en-GB"/>
+        </w:rPr>
+        <w:t>Convert Fraction to Decimal Number</w:t>
+      </w:r>
+    </w:p>
+    <w:p>
+      <w:pPr>
+        <w:pStyle w:val="ListParagraph"/>
+        <w:numPr>
+          <w:ilvl w:val="1"/>
+          <w:numId w:val="3"/>
+        </w:numPr>
+        <w:rPr>
+          <w:lang w:val="en-GB"/>
+        </w:rPr>
+      </w:pPr>
+      <w:r>
+        <w:rPr>
+          <w:lang w:val="en-GB"/>
+        </w:rPr>
+        <w:t>Convert Decimal Number to Fraction</w:t>
+      </w:r>
+    </w:p>
+    <w:p>
+      <w:pPr>
+        <w:pStyle w:val="ListParagraph"/>
+        <w:numPr>
+          <w:ilvl w:val="1"/>
+          <w:numId w:val="3"/>
+        </w:numPr>
+        <w:rPr>
+          <w:lang w:val="en-GB"/>
+        </w:rPr>
+      </w:pPr>
+      <w:r>
+        <w:rPr>
+          <w:lang w:val="en-GB"/>
+        </w:rPr>
+        <w:t>Comparing Decimal Numbers</w:t>
       </w:r>
     </w:p>
     <w:p>
@@ -136,16 +619,68 @@
           <w:numId w:val="3"/>
         </w:numPr>
         <w:rPr>
-          <w:rFonts w:ascii="Fira Code" w:hAnsi="Fira Code" w:cs="Fira Code"/>
-          <w:lang w:val="en-GB"/>
-        </w:rPr>
-      </w:pPr>
-      <w:r>
-        <w:rPr>
-          <w:rFonts w:ascii="Fira Code" w:hAnsi="Fira Code" w:cs="Fira Code"/>
-          <w:lang w:val="en-GB"/>
-        </w:rPr>
-        <w:t>Percentages</w:t>
+          <w:lang w:val="en-GB"/>
+        </w:rPr>
+      </w:pPr>
+      <w:r>
+        <w:rPr>
+          <w:lang w:val="en-GB"/>
+        </w:rPr>
+        <w:t>Decimal Numbers – Four Operations</w:t>
+      </w:r>
+    </w:p>
+    <w:p>
+      <w:pPr>
+        <w:pStyle w:val="ListParagraph"/>
+        <w:numPr>
+          <w:ilvl w:val="1"/>
+          <w:numId w:val="3"/>
+        </w:numPr>
+        <w:rPr>
+          <w:lang w:val="en-GB"/>
+        </w:rPr>
+      </w:pPr>
+      <w:r>
+        <w:rPr>
+          <w:lang w:val="en-GB"/>
+        </w:rPr>
+        <w:t>Addition and Subtraction of Decimal Numbers</w:t>
+      </w:r>
+    </w:p>
+    <w:p>
+      <w:pPr>
+        <w:pStyle w:val="ListParagraph"/>
+        <w:numPr>
+          <w:ilvl w:val="1"/>
+          <w:numId w:val="3"/>
+        </w:numPr>
+        <w:rPr>
+          <w:lang w:val="en-GB"/>
+        </w:rPr>
+      </w:pPr>
+      <w:r>
+        <w:rPr>
+          <w:lang w:val="en-GB"/>
+        </w:rPr>
+        <w:t>Multiplication of Decimals by a Whole Number</w:t>
+      </w:r>
+    </w:p>
+    <w:p>
+      <w:pPr>
+        <w:pStyle w:val="ListParagraph"/>
+        <w:numPr>
+          <w:ilvl w:val="1"/>
+          <w:numId w:val="3"/>
+        </w:numPr>
+        <w:rPr>
+          <w:lang w:val="en-GB"/>
+        </w:rPr>
+      </w:pPr>
+      <w:r>
+        <w:rPr>
+          <w:lang w:val="en-GB"/>
+        </w:rPr>
+        <w:t>Division of Decimals by a Whole Number</w:t>
       </w:r>
     </w:p>
     <w:p>
@@ -156,16 +691,189 @@
           <w:numId w:val="3"/>
         </w:numPr>
         <w:rPr>
-          <w:rFonts w:ascii="Fira Code" w:hAnsi="Fira Code" w:cs="Fira Code"/>
-          <w:lang w:val="en-GB"/>
-        </w:rPr>
-      </w:pPr>
-      <w:r>
-        <w:rPr>
-          <w:rFonts w:ascii="Fira Code" w:hAnsi="Fira Code" w:cs="Fira Code"/>
-          <w:lang w:val="en-GB"/>
-        </w:rPr>
-        <w:t>Numbers</w:t>
+          <w:lang w:val="en-GB"/>
+        </w:rPr>
+      </w:pPr>
+      <w:r>
+        <w:rPr>
+          <w:lang w:val="en-GB"/>
+        </w:rPr>
+        <w:t>Measurement</w:t>
+      </w:r>
+    </w:p>
+    <w:p>
+      <w:pPr>
+        <w:pStyle w:val="ListParagraph"/>
+        <w:numPr>
+          <w:ilvl w:val="1"/>
+          <w:numId w:val="3"/>
+        </w:numPr>
+        <w:rPr>
+          <w:lang w:val="en-GB"/>
+        </w:rPr>
+      </w:pPr>
+      <w:r>
+        <w:rPr>
+          <w:lang w:val="en-GB"/>
+        </w:rPr>
+        <w:t>Metric System</w:t>
+      </w:r>
+    </w:p>
+    <w:p>
+      <w:pPr>
+        <w:pStyle w:val="ListParagraph"/>
+        <w:numPr>
+          <w:ilvl w:val="1"/>
+          <w:numId w:val="3"/>
+        </w:numPr>
+        <w:rPr>
+          <w:lang w:val="en-GB"/>
+        </w:rPr>
+      </w:pPr>
+      <w:r>
+        <w:rPr>
+          <w:lang w:val="en-GB"/>
+        </w:rPr>
+        <w:t>Conversion of Metric Measures</w:t>
+      </w:r>
+    </w:p>
+    <w:p>
+      <w:pPr>
+        <w:pStyle w:val="ListParagraph"/>
+        <w:numPr>
+          <w:ilvl w:val="1"/>
+          <w:numId w:val="3"/>
+        </w:numPr>
+        <w:rPr>
+          <w:lang w:val="en-GB"/>
+        </w:rPr>
+      </w:pPr>
+      <w:r>
+        <w:rPr>
+          <w:lang w:val="en-GB"/>
+        </w:rPr>
+        <w:t>Expressing Measurement of Length in Decimal Form</w:t>
+      </w:r>
+    </w:p>
+    <w:p>
+      <w:pPr>
+        <w:pStyle w:val="ListParagraph"/>
+        <w:numPr>
+          <w:ilvl w:val="1"/>
+          <w:numId w:val="3"/>
+        </w:numPr>
+        <w:rPr>
+          <w:lang w:val="en-GB"/>
+        </w:rPr>
+      </w:pPr>
+      <w:r>
+        <w:rPr>
+          <w:lang w:val="en-GB"/>
+        </w:rPr>
+        <w:lastRenderedPageBreak/>
+        <w:t>Conversion of Units of Weight</w:t>
+      </w:r>
+    </w:p>
+    <w:p>
+      <w:pPr>
+        <w:pStyle w:val="ListParagraph"/>
+        <w:numPr>
+          <w:ilvl w:val="1"/>
+          <w:numId w:val="3"/>
+        </w:numPr>
+        <w:rPr>
+          <w:lang w:val="en-GB"/>
+        </w:rPr>
+      </w:pPr>
+      <w:r>
+        <w:rPr>
+          <w:lang w:val="en-GB"/>
+        </w:rPr>
+        <w:t>Expressing Measurement of Length in Decimal Form</w:t>
+      </w:r>
+    </w:p>
+    <w:p>
+      <w:pPr>
+        <w:pStyle w:val="ListParagraph"/>
+        <w:numPr>
+          <w:ilvl w:val="1"/>
+          <w:numId w:val="3"/>
+        </w:numPr>
+        <w:rPr>
+          <w:lang w:val="en-GB"/>
+        </w:rPr>
+      </w:pPr>
+      <w:r>
+        <w:rPr>
+          <w:lang w:val="en-GB"/>
+        </w:rPr>
+        <w:t>Conversion of Units of Capacity</w:t>
+      </w:r>
+    </w:p>
+    <w:p>
+      <w:pPr>
+        <w:pStyle w:val="ListParagraph"/>
+        <w:numPr>
+          <w:ilvl w:val="1"/>
+          <w:numId w:val="3"/>
+        </w:numPr>
+        <w:rPr>
+          <w:lang w:val="en-GB"/>
+        </w:rPr>
+      </w:pPr>
+      <w:r>
+        <w:rPr>
+          <w:lang w:val="en-GB"/>
+        </w:rPr>
+        <w:t xml:space="preserve">Expressing Measurement of </w:t>
+      </w:r>
+      <w:r>
+        <w:rPr>
+          <w:lang w:val="en-GB"/>
+        </w:rPr>
+        <w:t>Capacity</w:t>
+      </w:r>
+      <w:r>
+        <w:rPr>
+          <w:lang w:val="en-GB"/>
+        </w:rPr>
+        <w:t xml:space="preserve"> in Decimal Form</w:t>
+      </w:r>
+    </w:p>
+    <w:p>
+      <w:pPr>
+        <w:pStyle w:val="ListParagraph"/>
+        <w:numPr>
+          <w:ilvl w:val="1"/>
+          <w:numId w:val="3"/>
+        </w:numPr>
+        <w:rPr>
+          <w:lang w:val="en-GB"/>
+        </w:rPr>
+      </w:pPr>
+      <w:r>
+        <w:rPr>
+          <w:lang w:val="en-GB"/>
+        </w:rPr>
+        <w:t>Addition and Subtraction of Metric Measures</w:t>
+      </w:r>
+    </w:p>
+    <w:p>
+      <w:pPr>
+        <w:pStyle w:val="ListParagraph"/>
+        <w:numPr>
+          <w:ilvl w:val="1"/>
+          <w:numId w:val="3"/>
+        </w:numPr>
+        <w:rPr>
+          <w:lang w:val="en-GB"/>
+        </w:rPr>
+      </w:pPr>
+      <w:r>
+        <w:rPr>
+          <w:lang w:val="en-GB"/>
+        </w:rPr>
+        <w:t>Multiplication and Division of Metric Measures</w:t>
       </w:r>
     </w:p>
     <w:p>
@@ -176,47 +884,536 @@
           <w:numId w:val="3"/>
         </w:numPr>
         <w:rPr>
-          <w:rFonts w:ascii="Fira Code" w:hAnsi="Fira Code" w:cs="Fira Code"/>
-          <w:lang w:val="en-GB"/>
-        </w:rPr>
-      </w:pPr>
-      <w:r>
-        <w:rPr>
-          <w:rFonts w:ascii="Fira Code" w:hAnsi="Fira Code" w:cs="Fira Code"/>
-          <w:lang w:val="en-GB"/>
-        </w:rPr>
-        <w:t>Shapes</w:t>
-      </w:r>
-      <w:r>
-        <w:rPr>
-          <w:rFonts w:ascii="Fira Code" w:hAnsi="Fira Code" w:cs="Fira Code"/>
-          <w:lang w:val="en-GB"/>
-        </w:rPr>
-        <w:t xml:space="preserve"> and Measurements</w:t>
-      </w:r>
-    </w:p>
-    <w:p>
-      <w:pPr>
-        <w:pStyle w:val="ListParagraph"/>
-        <w:rPr>
-          <w:rFonts w:ascii="Fira Code" w:hAnsi="Fira Code" w:cs="Fira Code"/>
-          <w:lang w:val="en-GB"/>
-        </w:rPr>
-      </w:pPr>
-    </w:p>
-    <w:p>
-      <w:pPr>
-        <w:rPr>
-          <w:rFonts w:ascii="Fira Code" w:hAnsi="Fira Code" w:cs="Fira Code"/>
-          <w:lang w:val="en-GB"/>
-        </w:rPr>
-      </w:pPr>
-      <w:r>
-        <w:rPr>
-          <w:rFonts w:ascii="Fira Code" w:hAnsi="Fira Code" w:cs="Fira Code"/>
-          <w:lang w:val="en-GB"/>
-        </w:rPr>
-        <w:t>** Workflow</w:t>
+          <w:lang w:val="en-GB"/>
+        </w:rPr>
+      </w:pPr>
+      <w:r>
+        <w:rPr>
+          <w:lang w:val="en-GB"/>
+        </w:rPr>
+        <w:t>Time, Temperature and Money</w:t>
+      </w:r>
+    </w:p>
+    <w:p>
+      <w:pPr>
+        <w:pStyle w:val="ListParagraph"/>
+        <w:numPr>
+          <w:ilvl w:val="1"/>
+          <w:numId w:val="3"/>
+        </w:numPr>
+        <w:rPr>
+          <w:lang w:val="en-GB"/>
+        </w:rPr>
+      </w:pPr>
+      <w:r>
+        <w:rPr>
+          <w:lang w:val="en-GB"/>
+        </w:rPr>
+        <w:t>Conversion of Temperature from Celsius to Fahrenheit</w:t>
+      </w:r>
+    </w:p>
+    <w:p>
+      <w:pPr>
+        <w:pStyle w:val="ListParagraph"/>
+        <w:numPr>
+          <w:ilvl w:val="1"/>
+          <w:numId w:val="3"/>
+        </w:numPr>
+        <w:rPr>
+          <w:lang w:val="en-GB"/>
+        </w:rPr>
+      </w:pPr>
+      <w:r>
+        <w:rPr>
+          <w:lang w:val="en-GB"/>
+        </w:rPr>
+        <w:t>Conversion of Temperature from Fahrenheit</w:t>
+      </w:r>
+      <w:r>
+        <w:rPr>
+          <w:lang w:val="en-GB"/>
+        </w:rPr>
+        <w:t xml:space="preserve"> </w:t>
+      </w:r>
+      <w:r>
+        <w:rPr>
+          <w:lang w:val="en-GB"/>
+        </w:rPr>
+        <w:t>to Celsius</w:t>
+      </w:r>
+    </w:p>
+    <w:p>
+      <w:pPr>
+        <w:pStyle w:val="ListParagraph"/>
+        <w:numPr>
+          <w:ilvl w:val="0"/>
+          <w:numId w:val="3"/>
+        </w:numPr>
+        <w:rPr>
+          <w:lang w:val="en-GB"/>
+        </w:rPr>
+      </w:pPr>
+      <w:r>
+        <w:rPr>
+          <w:lang w:val="en-GB"/>
+        </w:rPr>
+        <w:t>Profit, Loss and Unitary Method</w:t>
+      </w:r>
+    </w:p>
+    <w:p>
+      <w:pPr>
+        <w:pStyle w:val="ListParagraph"/>
+        <w:numPr>
+          <w:ilvl w:val="1"/>
+          <w:numId w:val="3"/>
+        </w:numPr>
+        <w:tabs>
+          <w:tab w:val="left" w:pos="993"/>
+        </w:tabs>
+        <w:rPr>
+          <w:lang w:val="en-GB"/>
+        </w:rPr>
+      </w:pPr>
+      <w:r>
+        <w:rPr>
+          <w:lang w:val="en-GB"/>
+        </w:rPr>
+        <w:t>Profit and Loss</w:t>
+      </w:r>
+    </w:p>
+    <w:p>
+      <w:pPr>
+        <w:pStyle w:val="ListParagraph"/>
+        <w:numPr>
+          <w:ilvl w:val="1"/>
+          <w:numId w:val="3"/>
+        </w:numPr>
+        <w:tabs>
+          <w:tab w:val="left" w:pos="993"/>
+        </w:tabs>
+        <w:rPr>
+          <w:lang w:val="en-GB"/>
+        </w:rPr>
+      </w:pPr>
+      <w:r>
+        <w:rPr>
+          <w:lang w:val="en-GB"/>
+        </w:rPr>
+        <w:t>Unitary Method</w:t>
+      </w:r>
+    </w:p>
+    <w:p>
+      <w:pPr>
+        <w:pStyle w:val="ListParagraph"/>
+        <w:numPr>
+          <w:ilvl w:val="0"/>
+          <w:numId w:val="3"/>
+        </w:numPr>
+        <w:rPr>
+          <w:lang w:val="en-GB"/>
+        </w:rPr>
+      </w:pPr>
+      <w:r>
+        <w:rPr>
+          <w:lang w:val="en-GB"/>
+        </w:rPr>
+        <w:t>Percentage</w:t>
+      </w:r>
+    </w:p>
+    <w:p>
+      <w:pPr>
+        <w:pStyle w:val="ListParagraph"/>
+        <w:numPr>
+          <w:ilvl w:val="1"/>
+          <w:numId w:val="3"/>
+        </w:numPr>
+        <w:tabs>
+          <w:tab w:val="left" w:pos="993"/>
+        </w:tabs>
+        <w:rPr>
+          <w:lang w:val="en-GB"/>
+        </w:rPr>
+      </w:pPr>
+      <w:r>
+        <w:rPr>
+          <w:lang w:val="en-GB"/>
+        </w:rPr>
+        <w:t>Conversion</w:t>
+      </w:r>
+      <w:r>
+        <w:rPr>
+          <w:lang w:val="en-GB"/>
+        </w:rPr>
+        <w:t xml:space="preserve"> of Percentage to Fraction</w:t>
+      </w:r>
+    </w:p>
+    <w:p>
+      <w:pPr>
+        <w:pStyle w:val="ListParagraph"/>
+        <w:numPr>
+          <w:ilvl w:val="1"/>
+          <w:numId w:val="3"/>
+        </w:numPr>
+        <w:tabs>
+          <w:tab w:val="left" w:pos="993"/>
+        </w:tabs>
+        <w:rPr>
+          <w:lang w:val="en-GB"/>
+        </w:rPr>
+      </w:pPr>
+      <w:r>
+        <w:rPr>
+          <w:lang w:val="en-GB"/>
+        </w:rPr>
+        <w:t>Conversion of Percentage to Decimal</w:t>
+      </w:r>
+    </w:p>
+    <w:p>
+      <w:pPr>
+        <w:pStyle w:val="ListParagraph"/>
+        <w:numPr>
+          <w:ilvl w:val="1"/>
+          <w:numId w:val="3"/>
+        </w:numPr>
+        <w:tabs>
+          <w:tab w:val="left" w:pos="993"/>
+        </w:tabs>
+        <w:rPr>
+          <w:lang w:val="en-GB"/>
+        </w:rPr>
+      </w:pPr>
+      <w:r>
+        <w:rPr>
+          <w:lang w:val="en-GB"/>
+        </w:rPr>
+        <w:t>Conversion of Fraction to Percentage</w:t>
+      </w:r>
+    </w:p>
+    <w:p>
+      <w:pPr>
+        <w:pStyle w:val="ListParagraph"/>
+        <w:numPr>
+          <w:ilvl w:val="1"/>
+          <w:numId w:val="3"/>
+        </w:numPr>
+        <w:tabs>
+          <w:tab w:val="left" w:pos="993"/>
+        </w:tabs>
+        <w:rPr>
+          <w:lang w:val="en-GB"/>
+        </w:rPr>
+      </w:pPr>
+      <w:r>
+        <w:rPr>
+          <w:lang w:val="en-GB"/>
+        </w:rPr>
+        <w:t>Conversion of Decimal to Percentage</w:t>
+      </w:r>
+      <w:r>
+        <w:rPr>
+          <w:lang w:val="en-GB"/>
+        </w:rPr>
+        <w:t xml:space="preserve"> </w:t>
+      </w:r>
+    </w:p>
+    <w:p>
+      <w:pPr>
+        <w:pStyle w:val="ListParagraph"/>
+        <w:numPr>
+          <w:ilvl w:val="0"/>
+          <w:numId w:val="3"/>
+        </w:numPr>
+        <w:rPr>
+          <w:lang w:val="en-GB"/>
+        </w:rPr>
+      </w:pPr>
+      <w:r>
+        <w:rPr>
+          <w:lang w:val="en-GB"/>
+        </w:rPr>
+        <w:t>Geometry</w:t>
+      </w:r>
+    </w:p>
+    <w:p>
+      <w:pPr>
+        <w:pStyle w:val="ListParagraph"/>
+        <w:numPr>
+          <w:ilvl w:val="1"/>
+          <w:numId w:val="3"/>
+        </w:numPr>
+        <w:tabs>
+          <w:tab w:val="left" w:pos="993"/>
+        </w:tabs>
+        <w:rPr>
+          <w:lang w:val="en-GB"/>
+        </w:rPr>
+      </w:pPr>
+      <w:r>
+        <w:rPr>
+          <w:lang w:val="en-GB"/>
+        </w:rPr>
+        <w:t>Angles</w:t>
+      </w:r>
+      <w:r>
+        <w:rPr>
+          <w:lang w:val="en-GB"/>
+        </w:rPr>
+        <w:t xml:space="preserve"> &amp; Measure of Angles</w:t>
+      </w:r>
+    </w:p>
+    <w:p>
+      <w:pPr>
+        <w:pStyle w:val="ListParagraph"/>
+        <w:numPr>
+          <w:ilvl w:val="1"/>
+          <w:numId w:val="3"/>
+        </w:numPr>
+        <w:tabs>
+          <w:tab w:val="left" w:pos="993"/>
+        </w:tabs>
+        <w:rPr>
+          <w:lang w:val="en-GB"/>
+        </w:rPr>
+      </w:pPr>
+      <w:r>
+        <w:rPr>
+          <w:lang w:val="en-GB"/>
+        </w:rPr>
+        <w:t>Types of Angles</w:t>
+      </w:r>
+    </w:p>
+    <w:p>
+      <w:pPr>
+        <w:pStyle w:val="ListParagraph"/>
+        <w:numPr>
+          <w:ilvl w:val="1"/>
+          <w:numId w:val="3"/>
+        </w:numPr>
+        <w:tabs>
+          <w:tab w:val="left" w:pos="993"/>
+        </w:tabs>
+        <w:rPr>
+          <w:lang w:val="en-GB"/>
+        </w:rPr>
+      </w:pPr>
+      <w:r>
+        <w:rPr>
+          <w:lang w:val="en-GB"/>
+        </w:rPr>
+        <w:t>Types of Lines</w:t>
+      </w:r>
+    </w:p>
+    <w:p>
+      <w:pPr>
+        <w:pStyle w:val="ListParagraph"/>
+        <w:numPr>
+          <w:ilvl w:val="1"/>
+          <w:numId w:val="3"/>
+        </w:numPr>
+        <w:tabs>
+          <w:tab w:val="left" w:pos="993"/>
+        </w:tabs>
+        <w:rPr>
+          <w:lang w:val="en-GB"/>
+        </w:rPr>
+      </w:pPr>
+      <w:r>
+        <w:rPr>
+          <w:lang w:val="en-GB"/>
+        </w:rPr>
+        <w:t>Circle</w:t>
+      </w:r>
+    </w:p>
+    <w:p>
+      <w:pPr>
+        <w:pStyle w:val="ListParagraph"/>
+        <w:numPr>
+          <w:ilvl w:val="1"/>
+          <w:numId w:val="3"/>
+        </w:numPr>
+        <w:tabs>
+          <w:tab w:val="left" w:pos="993"/>
+        </w:tabs>
+        <w:rPr>
+          <w:lang w:val="en-GB"/>
+        </w:rPr>
+      </w:pPr>
+      <w:r>
+        <w:rPr>
+          <w:lang w:val="en-GB"/>
+        </w:rPr>
+        <w:t>Arc of Circle</w:t>
+      </w:r>
+    </w:p>
+    <w:p>
+      <w:pPr>
+        <w:pStyle w:val="ListParagraph"/>
+        <w:numPr>
+          <w:ilvl w:val="1"/>
+          <w:numId w:val="3"/>
+        </w:numPr>
+        <w:tabs>
+          <w:tab w:val="left" w:pos="993"/>
+        </w:tabs>
+        <w:rPr>
+          <w:lang w:val="en-GB"/>
+        </w:rPr>
+      </w:pPr>
+      <w:r>
+        <w:rPr>
+          <w:lang w:val="en-GB"/>
+        </w:rPr>
+        <w:t>Circumference of Circle</w:t>
+      </w:r>
+    </w:p>
+    <w:p>
+      <w:pPr>
+        <w:pStyle w:val="ListParagraph"/>
+        <w:numPr>
+          <w:ilvl w:val="1"/>
+          <w:numId w:val="3"/>
+        </w:numPr>
+        <w:tabs>
+          <w:tab w:val="left" w:pos="993"/>
+        </w:tabs>
+        <w:rPr>
+          <w:lang w:val="en-GB"/>
+        </w:rPr>
+      </w:pPr>
+      <w:r>
+        <w:rPr>
+          <w:lang w:val="en-GB"/>
+        </w:rPr>
+        <w:t>Relation between Diameter and Circumference</w:t>
+      </w:r>
+    </w:p>
+    <w:p>
+      <w:pPr>
+        <w:pStyle w:val="ListParagraph"/>
+        <w:numPr>
+          <w:ilvl w:val="0"/>
+          <w:numId w:val="3"/>
+        </w:numPr>
+        <w:rPr>
+          <w:lang w:val="en-GB"/>
+        </w:rPr>
+      </w:pPr>
+      <w:r>
+        <w:rPr>
+          <w:lang w:val="en-GB"/>
+        </w:rPr>
+        <w:t>Perimeter, Area and Volume</w:t>
+      </w:r>
+    </w:p>
+    <w:p>
+      <w:pPr>
+        <w:pStyle w:val="ListParagraph"/>
+        <w:numPr>
+          <w:ilvl w:val="1"/>
+          <w:numId w:val="3"/>
+        </w:numPr>
+        <w:tabs>
+          <w:tab w:val="left" w:pos="993"/>
+        </w:tabs>
+        <w:rPr>
+          <w:lang w:val="en-GB"/>
+        </w:rPr>
+      </w:pPr>
+      <w:r>
+        <w:rPr>
+          <w:lang w:val="en-GB"/>
+        </w:rPr>
+        <w:t>Perimeter and Area of Square, Rectangle and Triangle</w:t>
+      </w:r>
+    </w:p>
+    <w:p>
+      <w:pPr>
+        <w:pStyle w:val="ListParagraph"/>
+        <w:numPr>
+          <w:ilvl w:val="1"/>
+          <w:numId w:val="3"/>
+        </w:numPr>
+        <w:tabs>
+          <w:tab w:val="left" w:pos="993"/>
+        </w:tabs>
+        <w:rPr>
+          <w:lang w:val="en-GB"/>
+        </w:rPr>
+      </w:pPr>
+      <w:r>
+        <w:rPr>
+          <w:lang w:val="en-GB"/>
+        </w:rPr>
+        <w:t>Volume of Cube and Cuboid</w:t>
+      </w:r>
+    </w:p>
+    <w:p>
+      <w:pPr>
+        <w:pStyle w:val="ListParagraph"/>
+        <w:numPr>
+          <w:ilvl w:val="0"/>
+          <w:numId w:val="3"/>
+        </w:numPr>
+        <w:rPr>
+          <w:lang w:val="en-GB"/>
+        </w:rPr>
+      </w:pPr>
+      <w:r>
+        <w:rPr>
+          <w:lang w:val="en-GB"/>
+        </w:rPr>
+        <w:t>Symmetry, Nets and Patterns</w:t>
+      </w:r>
+    </w:p>
+    <w:p>
+      <w:pPr>
+        <w:pStyle w:val="ListParagraph"/>
+        <w:numPr>
+          <w:ilvl w:val="0"/>
+          <w:numId w:val="3"/>
+        </w:numPr>
+        <w:rPr>
+          <w:lang w:val="en-GB"/>
+        </w:rPr>
+      </w:pPr>
+      <w:r>
+        <w:rPr>
+          <w:lang w:val="en-GB"/>
+        </w:rPr>
+        <w:t>Data Handling</w:t>
+      </w:r>
+    </w:p>
+    <w:p>
+      <w:pPr>
+        <w:pStyle w:val="ListParagraph"/>
+        <w:rPr>
+          <w:lang w:val="en-GB"/>
+        </w:rPr>
+      </w:pPr>
+    </w:p>
+    <w:p>
+      <w:pPr>
+        <w:rPr>
+          <w:sz w:val="28"/>
+          <w:szCs w:val="28"/>
+          <w:lang w:val="en-GB"/>
+        </w:rPr>
+      </w:pPr>
+      <w:r>
+        <w:rPr>
+          <w:sz w:val="28"/>
+          <w:szCs w:val="28"/>
+          <w:lang w:val="en-GB"/>
+        </w:rPr>
+        <w:t xml:space="preserve"># </w:t>
+      </w:r>
+      <w:r>
+        <w:rPr>
+          <w:sz w:val="28"/>
+          <w:szCs w:val="28"/>
+          <w:lang w:val="en-GB"/>
+        </w:rPr>
+        <w:t>Workflow</w:t>
       </w:r>
     </w:p>
     <w:p>
@@ -227,16 +1424,50 @@
           <w:numId w:val="2"/>
         </w:numPr>
         <w:rPr>
-          <w:rFonts w:ascii="Fira Code" w:hAnsi="Fira Code" w:cs="Fira Code"/>
-          <w:lang w:val="en-GB"/>
-        </w:rPr>
-      </w:pPr>
-      <w:r>
-        <w:rPr>
-          <w:rFonts w:ascii="Fira Code" w:hAnsi="Fira Code" w:cs="Fira Code"/>
-          <w:lang w:val="en-GB"/>
-        </w:rPr>
-        <w:t>User opens the application</w:t>
+          <w:lang w:val="en-GB"/>
+        </w:rPr>
+      </w:pPr>
+      <w:r>
+        <w:rPr>
+          <w:lang w:val="en-GB"/>
+        </w:rPr>
+        <w:t xml:space="preserve">User </w:t>
+      </w:r>
+      <w:r>
+        <w:rPr>
+          <w:lang w:val="en-GB"/>
+        </w:rPr>
+        <w:t xml:space="preserve">lands on </w:t>
+      </w:r>
+      <w:r>
+        <w:rPr>
+          <w:lang w:val="en-GB"/>
+        </w:rPr>
+        <w:t>“</w:t>
+      </w:r>
+      <w:r>
+        <w:rPr>
+          <w:lang w:val="en-GB"/>
+        </w:rPr>
+        <w:t>Home</w:t>
+      </w:r>
+      <w:r>
+        <w:rPr>
+          <w:lang w:val="en-GB"/>
+        </w:rPr>
+        <w:t xml:space="preserve"> </w:t>
+      </w:r>
+      <w:r>
+        <w:rPr>
+          <w:lang w:val="en-GB"/>
+        </w:rPr>
+        <w:t>page</w:t>
+      </w:r>
+      <w:r>
+        <w:rPr>
+          <w:lang w:val="en-GB"/>
+        </w:rPr>
+        <w:t>”</w:t>
       </w:r>
     </w:p>
     <w:p>
@@ -247,16 +1478,20 @@
           <w:numId w:val="2"/>
         </w:numPr>
         <w:rPr>
-          <w:rFonts w:ascii="Fira Code" w:hAnsi="Fira Code" w:cs="Fira Code"/>
-          <w:lang w:val="en-GB"/>
-        </w:rPr>
-      </w:pPr>
-      <w:r>
-        <w:rPr>
-          <w:rFonts w:ascii="Fira Code" w:hAnsi="Fira Code" w:cs="Fira Code"/>
+          <w:lang w:val="en-GB"/>
+        </w:rPr>
+      </w:pPr>
+      <w:r>
+        <w:rPr>
           <w:lang w:val="en-GB"/>
         </w:rPr>
         <w:t>User selects the topic</w:t>
+      </w:r>
+      <w:r>
+        <w:rPr>
+          <w:lang w:val="en-GB"/>
+        </w:rPr>
+        <w:t xml:space="preserve"> and lands on “Topic page”</w:t>
       </w:r>
     </w:p>
     <w:p>
@@ -267,16 +1502,516 @@
           <w:numId w:val="2"/>
         </w:numPr>
         <w:rPr>
-          <w:rFonts w:ascii="Fira Code" w:hAnsi="Fira Code" w:cs="Fira Code"/>
-          <w:lang w:val="en-GB"/>
-        </w:rPr>
-      </w:pPr>
-      <w:r>
-        <w:rPr>
-          <w:rFonts w:ascii="Fira Code" w:hAnsi="Fira Code" w:cs="Fira Code"/>
-          <w:lang w:val="en-GB"/>
-        </w:rPr>
-        <w:t>Concepts are explained using images and videos with few examples</w:t>
+          <w:lang w:val="en-GB"/>
+        </w:rPr>
+      </w:pPr>
+      <w:r>
+        <w:rPr>
+          <w:lang w:val="en-GB"/>
+        </w:rPr>
+        <w:t>User gets option</w:t>
+      </w:r>
+      <w:r>
+        <w:rPr>
+          <w:lang w:val="en-GB"/>
+        </w:rPr>
+        <w:t>s</w:t>
+      </w:r>
+      <w:r>
+        <w:rPr>
+          <w:lang w:val="en-GB"/>
+        </w:rPr>
+        <w:t xml:space="preserve"> to </w:t>
+      </w:r>
+      <w:r>
+        <w:rPr>
+          <w:lang w:val="en-GB"/>
+        </w:rPr>
+        <w:t xml:space="preserve">either </w:t>
+      </w:r>
+      <w:r>
+        <w:rPr>
+          <w:color w:val="00B0F0"/>
+          <w:lang w:val="en-GB"/>
+        </w:rPr>
+        <w:t>Take Q</w:t>
+      </w:r>
+      <w:r>
+        <w:rPr>
+          <w:color w:val="00B0F0"/>
+          <w:lang w:val="en-GB"/>
+        </w:rPr>
+        <w:t>uiz</w:t>
+      </w:r>
+      <w:r>
+        <w:rPr>
+          <w:lang w:val="en-GB"/>
+        </w:rPr>
+        <w:t xml:space="preserve"> or </w:t>
+      </w:r>
+      <w:r>
+        <w:rPr>
+          <w:color w:val="00B0F0"/>
+          <w:lang w:val="en-GB"/>
+        </w:rPr>
+        <w:t>Read</w:t>
+      </w:r>
+      <w:r>
+        <w:rPr>
+          <w:color w:val="00B0F0"/>
+          <w:lang w:val="en-GB"/>
+        </w:rPr>
+        <w:t xml:space="preserve"> the </w:t>
+      </w:r>
+      <w:r>
+        <w:rPr>
+          <w:color w:val="00B0F0"/>
+          <w:lang w:val="en-GB"/>
+        </w:rPr>
+        <w:t>T</w:t>
+      </w:r>
+      <w:r>
+        <w:rPr>
+          <w:color w:val="00B0F0"/>
+          <w:lang w:val="en-GB"/>
+        </w:rPr>
+        <w:t>opic</w:t>
+      </w:r>
+      <w:r>
+        <w:rPr>
+          <w:color w:val="00B0F0"/>
+          <w:lang w:val="en-GB"/>
+        </w:rPr>
+        <w:t xml:space="preserve"> </w:t>
+      </w:r>
+      <w:r>
+        <w:rPr>
+          <w:lang w:val="en-GB"/>
+        </w:rPr>
+        <w:t xml:space="preserve">or </w:t>
+      </w:r>
+      <w:r>
+        <w:rPr>
+          <w:color w:val="00B0F0"/>
+          <w:lang w:val="en-GB"/>
+        </w:rPr>
+        <w:t>B</w:t>
+      </w:r>
+      <w:r>
+        <w:rPr>
+          <w:color w:val="00B0F0"/>
+          <w:lang w:val="en-GB"/>
+        </w:rPr>
+        <w:t>ack to Home page</w:t>
+      </w:r>
+    </w:p>
+    <w:p>
+      <w:pPr>
+        <w:pStyle w:val="ListParagraph"/>
+        <w:numPr>
+          <w:ilvl w:val="1"/>
+          <w:numId w:val="2"/>
+        </w:numPr>
+        <w:rPr>
+          <w:lang w:val="en-GB"/>
+        </w:rPr>
+      </w:pPr>
+      <w:r>
+        <w:rPr>
+          <w:lang w:val="en-GB"/>
+        </w:rPr>
+        <w:t>User selects Read the Topic</w:t>
+      </w:r>
+    </w:p>
+    <w:p>
+      <w:pPr>
+        <w:pStyle w:val="ListParagraph"/>
+        <w:numPr>
+          <w:ilvl w:val="2"/>
+          <w:numId w:val="2"/>
+        </w:numPr>
+        <w:rPr>
+          <w:lang w:val="en-GB"/>
+        </w:rPr>
+      </w:pPr>
+      <w:r>
+        <w:rPr>
+          <w:lang w:val="en-GB"/>
+        </w:rPr>
+        <w:t xml:space="preserve">New page opens with all the sub-topics in </w:t>
+      </w:r>
+      <w:r>
+        <w:rPr>
+          <w:lang w:val="en-GB"/>
+        </w:rPr>
+        <w:t xml:space="preserve">the </w:t>
+      </w:r>
+      <w:r>
+        <w:rPr>
+          <w:lang w:val="en-GB"/>
+        </w:rPr>
+        <w:t>respective Topic</w:t>
+      </w:r>
+    </w:p>
+    <w:p>
+      <w:pPr>
+        <w:pStyle w:val="ListParagraph"/>
+        <w:numPr>
+          <w:ilvl w:val="2"/>
+          <w:numId w:val="2"/>
+        </w:numPr>
+        <w:rPr>
+          <w:lang w:val="en-GB"/>
+        </w:rPr>
+      </w:pPr>
+      <w:r>
+        <w:rPr>
+          <w:lang w:val="en-GB"/>
+        </w:rPr>
+        <w:t>User clicks a sub-topic</w:t>
+      </w:r>
+    </w:p>
+    <w:p>
+      <w:pPr>
+        <w:pStyle w:val="ListParagraph"/>
+        <w:numPr>
+          <w:ilvl w:val="2"/>
+          <w:numId w:val="2"/>
+        </w:numPr>
+        <w:rPr>
+          <w:lang w:val="en-GB"/>
+        </w:rPr>
+      </w:pPr>
+      <w:r>
+        <w:rPr>
+          <w:lang w:val="en-GB"/>
+        </w:rPr>
+        <w:lastRenderedPageBreak/>
+        <w:t xml:space="preserve">New page opens with </w:t>
+      </w:r>
+      <w:r>
+        <w:rPr>
+          <w:lang w:val="en-GB"/>
+        </w:rPr>
+        <w:t>urls</w:t>
+      </w:r>
+      <w:r>
+        <w:rPr>
+          <w:lang w:val="en-GB"/>
+        </w:rPr>
+        <w:t xml:space="preserve"> of </w:t>
+      </w:r>
+      <w:r>
+        <w:rPr>
+          <w:lang w:val="en-GB"/>
+        </w:rPr>
+        <w:t>web</w:t>
+      </w:r>
+      <w:r>
+        <w:rPr>
+          <w:lang w:val="en-GB"/>
+        </w:rPr>
+        <w:t>pages to read and link of YouTube videos</w:t>
+      </w:r>
+      <w:r>
+        <w:rPr>
+          <w:lang w:val="en-GB"/>
+        </w:rPr>
+        <w:t>. There is also a button “Practice Test”</w:t>
+      </w:r>
+    </w:p>
+    <w:p>
+      <w:pPr>
+        <w:pStyle w:val="ListParagraph"/>
+        <w:numPr>
+          <w:ilvl w:val="3"/>
+          <w:numId w:val="2"/>
+        </w:numPr>
+        <w:rPr>
+          <w:lang w:val="en-GB"/>
+        </w:rPr>
+      </w:pPr>
+      <w:r>
+        <w:rPr>
+          <w:lang w:val="en-GB"/>
+        </w:rPr>
+        <w:t>User clicks urls of webpages. The page opens for reading. User close the page and he is back to previous page</w:t>
+      </w:r>
+    </w:p>
+    <w:p>
+      <w:pPr>
+        <w:pStyle w:val="ListParagraph"/>
+        <w:numPr>
+          <w:ilvl w:val="3"/>
+          <w:numId w:val="2"/>
+        </w:numPr>
+        <w:rPr>
+          <w:lang w:val="en-GB"/>
+        </w:rPr>
+      </w:pPr>
+      <w:r>
+        <w:rPr>
+          <w:lang w:val="en-GB"/>
+        </w:rPr>
+        <w:t xml:space="preserve">User click YouTube link. Related videos of the topic </w:t>
+      </w:r>
+      <w:r>
+        <w:rPr>
+          <w:lang w:val="en-GB"/>
+        </w:rPr>
+        <w:t>open</w:t>
+      </w:r>
+      <w:r>
+        <w:rPr>
+          <w:lang w:val="en-GB"/>
+        </w:rPr>
+        <w:t xml:space="preserve"> up in new tab.</w:t>
+      </w:r>
+    </w:p>
+    <w:p>
+      <w:pPr>
+        <w:pStyle w:val="ListParagraph"/>
+        <w:numPr>
+          <w:ilvl w:val="3"/>
+          <w:numId w:val="2"/>
+        </w:numPr>
+        <w:rPr>
+          <w:lang w:val="en-GB"/>
+        </w:rPr>
+      </w:pPr>
+      <w:r>
+        <w:rPr>
+          <w:lang w:val="en-GB"/>
+        </w:rPr>
+        <w:t>User clicks button Practice Test. Quiz of 05 questions for the respective subject will appear one by one on screen. It will test the understanding of the subject.</w:t>
+      </w:r>
+    </w:p>
+    <w:p>
+      <w:pPr>
+        <w:pStyle w:val="ListParagraph"/>
+        <w:numPr>
+          <w:ilvl w:val="1"/>
+          <w:numId w:val="2"/>
+        </w:numPr>
+        <w:rPr>
+          <w:lang w:val="en-GB"/>
+        </w:rPr>
+      </w:pPr>
+      <w:r>
+        <w:rPr>
+          <w:lang w:val="en-GB"/>
+        </w:rPr>
+        <w:t>User selects Take Quiz</w:t>
+      </w:r>
+    </w:p>
+    <w:p>
+      <w:pPr>
+        <w:pStyle w:val="ListParagraph"/>
+        <w:numPr>
+          <w:ilvl w:val="2"/>
+          <w:numId w:val="2"/>
+        </w:numPr>
+        <w:rPr>
+          <w:lang w:val="en-GB"/>
+        </w:rPr>
+      </w:pPr>
+      <w:r>
+        <w:rPr>
+          <w:lang w:val="en-GB"/>
+        </w:rPr>
+        <w:t>New page opens with button Level 1 and Level 2</w:t>
+      </w:r>
+    </w:p>
+    <w:p>
+      <w:pPr>
+        <w:pStyle w:val="ListParagraph"/>
+        <w:numPr>
+          <w:ilvl w:val="2"/>
+          <w:numId w:val="2"/>
+        </w:numPr>
+        <w:rPr>
+          <w:lang w:val="en-GB"/>
+        </w:rPr>
+      </w:pPr>
+      <w:r>
+        <w:rPr>
+          <w:lang w:val="en-GB"/>
+        </w:rPr>
+        <w:t>User selects either Level 1 or Level 2</w:t>
+      </w:r>
+    </w:p>
+    <w:p>
+      <w:pPr>
+        <w:pStyle w:val="ListParagraph"/>
+        <w:numPr>
+          <w:ilvl w:val="2"/>
+          <w:numId w:val="2"/>
+        </w:numPr>
+        <w:rPr>
+          <w:lang w:val="en-GB"/>
+        </w:rPr>
+      </w:pPr>
+      <w:r>
+        <w:rPr>
+          <w:lang w:val="en-GB"/>
+        </w:rPr>
+        <w:t xml:space="preserve">A </w:t>
+      </w:r>
+      <w:r>
+        <w:rPr>
+          <w:lang w:val="en-GB"/>
+        </w:rPr>
+        <w:t xml:space="preserve">Quiz of 10 questions with one question at a time </w:t>
+      </w:r>
+      <w:r>
+        <w:rPr>
+          <w:lang w:val="en-GB"/>
+        </w:rPr>
+        <w:t xml:space="preserve">will appear </w:t>
+      </w:r>
+      <w:r>
+        <w:rPr>
+          <w:lang w:val="en-GB"/>
+        </w:rPr>
+        <w:t>on screen</w:t>
+      </w:r>
+      <w:r>
+        <w:rPr>
+          <w:lang w:val="en-GB"/>
+        </w:rPr>
+        <w:t>. A timer will also appear on screen which will record the time taken to answer the question.</w:t>
+      </w:r>
+    </w:p>
+    <w:p>
+      <w:pPr>
+        <w:pStyle w:val="ListParagraph"/>
+        <w:numPr>
+          <w:ilvl w:val="2"/>
+          <w:numId w:val="2"/>
+        </w:numPr>
+        <w:rPr>
+          <w:lang w:val="en-GB"/>
+        </w:rPr>
+      </w:pPr>
+      <w:r>
+        <w:rPr>
+          <w:lang w:val="en-GB"/>
+        </w:rPr>
+        <w:t>At the end of quiz, user will see the marks along with total time taken for quiz. Along with marks, show an</w:t>
+      </w:r>
+      <w:r>
+        <w:rPr>
+          <w:lang w:val="en-GB"/>
+        </w:rPr>
+        <w:t xml:space="preserve"> emoji </w:t>
+      </w:r>
+      <w:r>
+        <w:rPr>
+          <w:lang w:val="en-GB"/>
+        </w:rPr>
+        <w:t xml:space="preserve">according to performance </w:t>
+      </w:r>
+      <w:r>
+        <w:rPr>
+          <w:lang w:val="en-GB"/>
+        </w:rPr>
+        <w:t xml:space="preserve">to keep </w:t>
+      </w:r>
+      <w:r>
+        <w:rPr>
+          <w:lang w:val="en-GB"/>
+        </w:rPr>
+        <w:t>user engaged.</w:t>
+      </w:r>
+    </w:p>
+    <w:p>
+      <w:pPr>
+        <w:pStyle w:val="ListParagraph"/>
+        <w:numPr>
+          <w:ilvl w:val="2"/>
+          <w:numId w:val="2"/>
+        </w:numPr>
+        <w:rPr>
+          <w:lang w:val="en-GB"/>
+        </w:rPr>
+      </w:pPr>
+      <w:r>
+        <w:rPr>
+          <w:lang w:val="en-GB"/>
+        </w:rPr>
+        <w:t xml:space="preserve">User can </w:t>
+      </w:r>
+      <w:r>
+        <w:rPr>
+          <w:lang w:val="en-GB"/>
+        </w:rPr>
+        <w:t xml:space="preserve">will see Review button. User can </w:t>
+      </w:r>
+      <w:r>
+        <w:rPr>
+          <w:lang w:val="en-GB"/>
+        </w:rPr>
+        <w:t xml:space="preserve">click </w:t>
+      </w:r>
+      <w:r>
+        <w:rPr>
+          <w:lang w:val="en-GB"/>
+        </w:rPr>
+        <w:t>Review button to see answer and explanation of each question.</w:t>
+      </w:r>
+    </w:p>
+    <w:p>
+      <w:pPr>
+        <w:pStyle w:val="ListParagraph"/>
+        <w:numPr>
+          <w:ilvl w:val="2"/>
+          <w:numId w:val="2"/>
+        </w:numPr>
+        <w:rPr>
+          <w:lang w:val="en-GB"/>
+        </w:rPr>
+      </w:pPr>
+      <w:r>
+        <w:rPr>
+          <w:lang w:val="en-GB"/>
+        </w:rPr>
+        <w:t xml:space="preserve">Show an Exit button to terminate or exit the quiz. If user clicks Exit then a message will appear on screen “do you want to exit the quiz? Yes / No” </w:t>
+      </w:r>
+    </w:p>
+    <w:p>
+      <w:pPr>
+        <w:pStyle w:val="ListParagraph"/>
+        <w:numPr>
+          <w:ilvl w:val="3"/>
+          <w:numId w:val="2"/>
+        </w:numPr>
+        <w:rPr>
+          <w:lang w:val="en-GB"/>
+        </w:rPr>
+      </w:pPr>
+      <w:r>
+        <w:rPr>
+          <w:lang w:val="en-GB"/>
+        </w:rPr>
+        <w:t>If user clicks Yes then exit the quiz and shows the score.</w:t>
+      </w:r>
+    </w:p>
+    <w:p>
+      <w:pPr>
+        <w:pStyle w:val="ListParagraph"/>
+        <w:numPr>
+          <w:ilvl w:val="3"/>
+          <w:numId w:val="2"/>
+        </w:numPr>
+        <w:rPr>
+          <w:lang w:val="en-GB"/>
+        </w:rPr>
+      </w:pPr>
+      <w:r>
+        <w:rPr>
+          <w:lang w:val="en-GB"/>
+        </w:rPr>
+        <w:t>If user clicks No then continue with quiz</w:t>
       </w:r>
     </w:p>
     <w:p>
@@ -287,16 +2022,14 @@
           <w:numId w:val="2"/>
         </w:numPr>
         <w:rPr>
-          <w:rFonts w:ascii="Fira Code" w:hAnsi="Fira Code" w:cs="Fira Code"/>
-          <w:lang w:val="en-GB"/>
-        </w:rPr>
-      </w:pPr>
-      <w:r>
-        <w:rPr>
-          <w:rFonts w:ascii="Fira Code" w:hAnsi="Fira Code" w:cs="Fira Code"/>
-          <w:lang w:val="en-GB"/>
-        </w:rPr>
-        <w:t>User gets option to proceed with quiz or revise the topic</w:t>
+          <w:lang w:val="en-GB"/>
+        </w:rPr>
+      </w:pPr>
+      <w:r>
+        <w:rPr>
+          <w:lang w:val="en-GB"/>
+        </w:rPr>
+        <w:t>User selects Mental Maths. New page opens with quiz.</w:t>
       </w:r>
     </w:p>
     <w:p>
@@ -307,16 +2040,47 @@
           <w:numId w:val="2"/>
         </w:numPr>
         <w:rPr>
-          <w:rFonts w:ascii="Fira Code" w:hAnsi="Fira Code" w:cs="Fira Code"/>
-          <w:lang w:val="en-GB"/>
-        </w:rPr>
-      </w:pPr>
-      <w:r>
-        <w:rPr>
-          <w:rFonts w:ascii="Fira Code" w:hAnsi="Fira Code" w:cs="Fira Code"/>
-          <w:lang w:val="en-GB"/>
-        </w:rPr>
-        <w:t>Quiz will be of 10 questions with one question at a time on screen</w:t>
+          <w:lang w:val="en-GB"/>
+        </w:rPr>
+      </w:pPr>
+      <w:r>
+        <w:rPr>
+          <w:lang w:val="en-GB"/>
+        </w:rPr>
+        <w:t>User should be able to navigate to previous screen or go to homepage from any screen.</w:t>
+      </w:r>
+    </w:p>
+    <w:p>
+      <w:pPr>
+        <w:pStyle w:val="ListParagraph"/>
+        <w:rPr>
+          <w:lang w:val="en-GB"/>
+        </w:rPr>
+      </w:pPr>
+    </w:p>
+    <w:p>
+      <w:pPr>
+        <w:rPr>
+          <w:sz w:val="28"/>
+          <w:szCs w:val="28"/>
+          <w:lang w:val="en-GB"/>
+        </w:rPr>
+      </w:pPr>
+      <w:r>
+        <w:rPr>
+          <w:sz w:val="28"/>
+          <w:szCs w:val="28"/>
+          <w:lang w:val="en-GB"/>
+        </w:rPr>
+        <w:t>#</w:t>
+      </w:r>
+      <w:r>
+        <w:rPr>
+          <w:sz w:val="28"/>
+          <w:szCs w:val="28"/>
+          <w:lang w:val="en-GB"/>
+        </w:rPr>
+        <w:t xml:space="preserve"> Application Features</w:t>
       </w:r>
     </w:p>
     <w:p>
@@ -327,16 +2091,104 @@
           <w:numId w:val="2"/>
         </w:numPr>
         <w:rPr>
-          <w:rFonts w:ascii="Fira Code" w:hAnsi="Fira Code" w:cs="Fira Code"/>
-          <w:lang w:val="en-GB"/>
-        </w:rPr>
-      </w:pPr>
-      <w:r>
-        <w:rPr>
-          <w:rFonts w:ascii="Fira Code" w:hAnsi="Fira Code" w:cs="Fira Code"/>
-          <w:lang w:val="en-GB"/>
-        </w:rPr>
-        <w:t>Show the marks at the end</w:t>
+          <w:lang w:val="en-GB"/>
+        </w:rPr>
+      </w:pPr>
+      <w:r>
+        <w:rPr>
+          <w:lang w:val="en-GB"/>
+        </w:rPr>
+        <w:t>Quiz</w:t>
+      </w:r>
+    </w:p>
+    <w:p>
+      <w:pPr>
+        <w:pStyle w:val="ListParagraph"/>
+        <w:numPr>
+          <w:ilvl w:val="1"/>
+          <w:numId w:val="2"/>
+        </w:numPr>
+        <w:rPr>
+          <w:lang w:val="en-GB"/>
+        </w:rPr>
+      </w:pPr>
+      <w:r>
+        <w:rPr>
+          <w:lang w:val="en-GB"/>
+        </w:rPr>
+        <w:t>Use algorithmic method to generate quiz</w:t>
+      </w:r>
+    </w:p>
+    <w:p>
+      <w:pPr>
+        <w:pStyle w:val="ListParagraph"/>
+        <w:numPr>
+          <w:ilvl w:val="1"/>
+          <w:numId w:val="2"/>
+        </w:numPr>
+        <w:rPr>
+          <w:lang w:val="en-GB"/>
+        </w:rPr>
+      </w:pPr>
+      <w:r>
+        <w:rPr>
+          <w:lang w:val="en-GB"/>
+        </w:rPr>
+        <w:t>Assign complexity to questions – simple, medium, complex</w:t>
+      </w:r>
+    </w:p>
+    <w:p>
+      <w:pPr>
+        <w:pStyle w:val="ListParagraph"/>
+        <w:numPr>
+          <w:ilvl w:val="1"/>
+          <w:numId w:val="2"/>
+        </w:numPr>
+        <w:rPr>
+          <w:lang w:val="en-GB"/>
+        </w:rPr>
+      </w:pPr>
+      <w:r>
+        <w:rPr>
+          <w:lang w:val="en-GB"/>
+        </w:rPr>
+        <w:t>There should be two levels of quiz</w:t>
+      </w:r>
+    </w:p>
+    <w:p>
+      <w:pPr>
+        <w:pStyle w:val="ListParagraph"/>
+        <w:numPr>
+          <w:ilvl w:val="2"/>
+          <w:numId w:val="2"/>
+        </w:numPr>
+        <w:rPr>
+          <w:lang w:val="en-GB"/>
+        </w:rPr>
+      </w:pPr>
+      <w:r>
+        <w:rPr>
+          <w:lang w:val="en-GB"/>
+        </w:rPr>
+        <w:t>Level 1 – mix of simple (60%) and medium (40%) questions</w:t>
+      </w:r>
+    </w:p>
+    <w:p>
+      <w:pPr>
+        <w:pStyle w:val="ListParagraph"/>
+        <w:numPr>
+          <w:ilvl w:val="2"/>
+          <w:numId w:val="2"/>
+        </w:numPr>
+        <w:rPr>
+          <w:lang w:val="en-GB"/>
+        </w:rPr>
+      </w:pPr>
+      <w:r>
+        <w:rPr>
+          <w:lang w:val="en-GB"/>
+        </w:rPr>
+        <w:t>Level 2 – mix of medium (70%) and complex (30%) questions</w:t>
       </w:r>
     </w:p>
     <w:p>
@@ -347,17 +2199,145 @@
           <w:numId w:val="2"/>
         </w:numPr>
         <w:rPr>
-          <w:rFonts w:ascii="Fira Code" w:hAnsi="Fira Code" w:cs="Fira Code"/>
-          <w:lang w:val="en-GB"/>
-        </w:rPr>
-      </w:pPr>
-      <w:r>
-        <w:rPr>
-          <w:rFonts w:ascii="Fira Code" w:hAnsi="Fira Code" w:cs="Fira Code"/>
-          <w:lang w:val="en-GB"/>
-        </w:rPr>
-        <w:t>User can click a question to see the explanation of correct answer</w:t>
-      </w:r>
+          <w:lang w:val="en-GB"/>
+        </w:rPr>
+      </w:pPr>
+      <w:r>
+        <w:rPr>
+          <w:lang w:val="en-GB"/>
+        </w:rPr>
+        <w:t>My Dashboard</w:t>
+      </w:r>
+    </w:p>
+    <w:p>
+      <w:pPr>
+        <w:pStyle w:val="ListParagraph"/>
+        <w:numPr>
+          <w:ilvl w:val="1"/>
+          <w:numId w:val="2"/>
+        </w:numPr>
+        <w:rPr>
+          <w:lang w:val="en-GB"/>
+        </w:rPr>
+      </w:pPr>
+      <w:r>
+        <w:rPr>
+          <w:lang w:val="en-GB"/>
+        </w:rPr>
+        <w:t xml:space="preserve">Student progress – </w:t>
+      </w:r>
+      <w:r>
+        <w:rPr>
+          <w:lang w:val="en-GB"/>
+        </w:rPr>
+        <w:t xml:space="preserve">analyze the performance of each sub-topic and </w:t>
+      </w:r>
+      <w:r>
+        <w:rPr>
+          <w:lang w:val="en-GB"/>
+        </w:rPr>
+        <w:t>categorize</w:t>
+      </w:r>
+      <w:r>
+        <w:rPr>
+          <w:lang w:val="en-GB"/>
+        </w:rPr>
+        <w:t xml:space="preserve"> level of understanding. </w:t>
+      </w:r>
+    </w:p>
+    <w:p>
+      <w:pPr>
+        <w:pStyle w:val="ListParagraph"/>
+        <w:numPr>
+          <w:ilvl w:val="2"/>
+          <w:numId w:val="2"/>
+        </w:numPr>
+        <w:rPr>
+          <w:lang w:val="en-GB"/>
+        </w:rPr>
+      </w:pPr>
+      <w:r>
+        <w:rPr>
+          <w:lang w:val="en-GB"/>
+        </w:rPr>
+        <w:lastRenderedPageBreak/>
+        <w:t>Expert = A</w:t>
+      </w:r>
+      <w:r>
+        <w:rPr>
+          <w:lang w:val="en-GB"/>
+        </w:rPr>
+        <w:t xml:space="preserve">vg score across the quiz </w:t>
+      </w:r>
+      <w:r>
+        <w:rPr>
+          <w:lang w:val="en-GB"/>
+        </w:rPr>
+        <w:t>&gt;= 8</w:t>
+      </w:r>
+    </w:p>
+    <w:p>
+      <w:pPr>
+        <w:pStyle w:val="ListParagraph"/>
+        <w:numPr>
+          <w:ilvl w:val="2"/>
+          <w:numId w:val="2"/>
+        </w:numPr>
+        <w:rPr>
+          <w:lang w:val="en-GB"/>
+        </w:rPr>
+      </w:pPr>
+      <w:r>
+        <w:rPr>
+          <w:lang w:val="en-GB"/>
+        </w:rPr>
+        <w:t xml:space="preserve">Good = 6 &lt;= </w:t>
+      </w:r>
+      <w:r>
+        <w:rPr>
+          <w:lang w:val="en-GB"/>
+        </w:rPr>
+        <w:t xml:space="preserve">avg score across the quiz </w:t>
+      </w:r>
+      <w:r>
+        <w:rPr>
+          <w:lang w:val="en-GB"/>
+        </w:rPr>
+        <w:t>&lt;</w:t>
+      </w:r>
+      <w:r>
+        <w:rPr>
+          <w:lang w:val="en-GB"/>
+        </w:rPr>
+        <w:t xml:space="preserve"> 8 </w:t>
+      </w:r>
+    </w:p>
+    <w:p>
+      <w:pPr>
+        <w:pStyle w:val="ListParagraph"/>
+        <w:numPr>
+          <w:ilvl w:val="2"/>
+          <w:numId w:val="2"/>
+        </w:numPr>
+        <w:rPr>
+          <w:lang w:val="en-GB"/>
+        </w:rPr>
+      </w:pPr>
+      <w:r>
+        <w:rPr>
+          <w:lang w:val="en-GB"/>
+        </w:rPr>
+        <w:t>Need to Improve = Avg score across the quiz &lt; 6</w:t>
+      </w:r>
+    </w:p>
+    <w:p>
+      <w:pPr>
+        <w:rPr>
+          <w:sz w:val="20"/>
+          <w:szCs w:val="20"/>
+          <w:lang w:val="en-GB"/>
+        </w:rPr>
+      </w:pPr>
     </w:p>
     <w:p>
       <w:pPr>
@@ -367,16 +2347,237 @@
           <w:numId w:val="2"/>
         </w:numPr>
         <w:rPr>
-          <w:rFonts w:ascii="Fira Code" w:hAnsi="Fira Code" w:cs="Fira Code"/>
-          <w:lang w:val="en-GB"/>
-        </w:rPr>
-      </w:pPr>
-      <w:r>
-        <w:rPr>
-          <w:rFonts w:ascii="Fira Code" w:hAnsi="Fira Code" w:cs="Fira Code"/>
-          <w:lang w:val="en-GB"/>
-        </w:rPr>
-        <w:t>Reward the user with funny emoji based on marks to keep him motivated</w:t>
+          <w:lang w:val="en-GB"/>
+        </w:rPr>
+      </w:pPr>
+      <w:r>
+        <w:rPr>
+          <w:lang w:val="en-GB"/>
+        </w:rPr>
+        <w:t>Mental Maths</w:t>
+      </w:r>
+    </w:p>
+    <w:p>
+      <w:pPr>
+        <w:pStyle w:val="ListParagraph"/>
+        <w:numPr>
+          <w:ilvl w:val="1"/>
+          <w:numId w:val="2"/>
+        </w:numPr>
+        <w:rPr>
+          <w:lang w:val="en-GB"/>
+        </w:rPr>
+      </w:pPr>
+      <w:r>
+        <w:rPr>
+          <w:lang w:val="en-GB"/>
+        </w:rPr>
+        <w:t>There is button “Mental Maths” on Home Page by side of My Dashboard</w:t>
+      </w:r>
+    </w:p>
+    <w:p>
+      <w:pPr>
+        <w:pStyle w:val="ListParagraph"/>
+        <w:numPr>
+          <w:ilvl w:val="1"/>
+          <w:numId w:val="2"/>
+        </w:numPr>
+        <w:rPr>
+          <w:lang w:val="en-GB"/>
+        </w:rPr>
+      </w:pPr>
+      <w:r>
+        <w:rPr>
+          <w:lang w:val="en-GB"/>
+        </w:rPr>
+        <w:t>It is quiz of 10 questions</w:t>
+      </w:r>
+      <w:r>
+        <w:rPr>
+          <w:lang w:val="en-GB"/>
+        </w:rPr>
+        <w:t>. One question at a time on screen</w:t>
+      </w:r>
+      <w:r>
+        <w:rPr>
+          <w:lang w:val="en-GB"/>
+        </w:rPr>
+        <w:t xml:space="preserve"> with timer. </w:t>
+      </w:r>
+    </w:p>
+    <w:p>
+      <w:pPr>
+        <w:pStyle w:val="ListParagraph"/>
+        <w:numPr>
+          <w:ilvl w:val="1"/>
+          <w:numId w:val="2"/>
+        </w:numPr>
+        <w:rPr>
+          <w:lang w:val="en-GB"/>
+        </w:rPr>
+      </w:pPr>
+      <w:r>
+        <w:rPr>
+          <w:lang w:val="en-GB"/>
+        </w:rPr>
+        <w:t xml:space="preserve">Question will stay on screen for </w:t>
+      </w:r>
+      <w:r>
+        <w:rPr>
+          <w:lang w:val="en-GB"/>
+        </w:rPr>
+        <w:t>90</w:t>
+      </w:r>
+      <w:r>
+        <w:rPr>
+          <w:lang w:val="en-GB"/>
+        </w:rPr>
+        <w:t xml:space="preserve"> sec. After </w:t>
+      </w:r>
+      <w:r>
+        <w:rPr>
+          <w:lang w:val="en-GB"/>
+        </w:rPr>
+        <w:t>90</w:t>
+      </w:r>
+      <w:r>
+        <w:rPr>
+          <w:lang w:val="en-GB"/>
+        </w:rPr>
+        <w:t xml:space="preserve"> sec, next question will appear.</w:t>
+      </w:r>
+    </w:p>
+    <w:p>
+      <w:pPr>
+        <w:pStyle w:val="ListParagraph"/>
+        <w:numPr>
+          <w:ilvl w:val="1"/>
+          <w:numId w:val="2"/>
+        </w:numPr>
+        <w:rPr>
+          <w:lang w:val="en-GB"/>
+        </w:rPr>
+      </w:pPr>
+      <w:r>
+        <w:rPr>
+          <w:lang w:val="en-GB"/>
+        </w:rPr>
+        <w:t>Show 04 answers on screen. Only one out of four is correct answer.</w:t>
+      </w:r>
+    </w:p>
+    <w:p>
+      <w:pPr>
+        <w:pStyle w:val="ListParagraph"/>
+        <w:numPr>
+          <w:ilvl w:val="1"/>
+          <w:numId w:val="2"/>
+        </w:numPr>
+        <w:rPr>
+          <w:lang w:val="en-GB"/>
+        </w:rPr>
+      </w:pPr>
+      <w:r>
+        <w:rPr>
+          <w:lang w:val="en-GB"/>
+        </w:rPr>
+        <w:t>User will select the answer and click submit. Next question will appear</w:t>
+      </w:r>
+    </w:p>
+    <w:p>
+      <w:pPr>
+        <w:pStyle w:val="ListParagraph"/>
+        <w:numPr>
+          <w:ilvl w:val="1"/>
+          <w:numId w:val="2"/>
+        </w:numPr>
+        <w:rPr>
+          <w:lang w:val="en-GB"/>
+        </w:rPr>
+      </w:pPr>
+      <w:r>
+        <w:rPr>
+          <w:lang w:val="en-GB"/>
+        </w:rPr>
+        <w:t xml:space="preserve">Application would not show whether answer is correct or wrong after clicking submit.   </w:t>
+      </w:r>
+    </w:p>
+    <w:p>
+      <w:pPr>
+        <w:pStyle w:val="ListParagraph"/>
+        <w:numPr>
+          <w:ilvl w:val="1"/>
+          <w:numId w:val="2"/>
+        </w:numPr>
+        <w:rPr>
+          <w:lang w:val="en-GB"/>
+        </w:rPr>
+      </w:pPr>
+      <w:r>
+        <w:rPr>
+          <w:lang w:val="en-GB"/>
+        </w:rPr>
+        <w:t xml:space="preserve">At the end of quiz, show the total marks and total time taken for quiz. </w:t>
+      </w:r>
+    </w:p>
+    <w:p>
+      <w:pPr>
+        <w:pStyle w:val="ListParagraph"/>
+        <w:numPr>
+          <w:ilvl w:val="1"/>
+          <w:numId w:val="2"/>
+        </w:numPr>
+        <w:rPr>
+          <w:lang w:val="en-GB"/>
+        </w:rPr>
+      </w:pPr>
+      <w:r>
+        <w:rPr>
+          <w:lang w:val="en-GB"/>
+        </w:rPr>
+        <w:t>User can click Review to see the answers and explanation. Also show time for individual questions.</w:t>
+      </w:r>
+    </w:p>
+    <w:p>
+      <w:pPr>
+        <w:pStyle w:val="ListParagraph"/>
+        <w:ind w:left="1440"/>
+        <w:rPr>
+          <w:lang w:val="en-GB"/>
+        </w:rPr>
+      </w:pPr>
+    </w:p>
+    <w:p>
+      <w:pPr>
+        <w:rPr>
+          <w:sz w:val="28"/>
+          <w:szCs w:val="28"/>
+          <w:lang w:val="en-GB"/>
+        </w:rPr>
+      </w:pPr>
+      <w:r>
+        <w:rPr>
+          <w:sz w:val="28"/>
+          <w:szCs w:val="28"/>
+          <w:lang w:val="en-GB"/>
+        </w:rPr>
+        <w:t># Business Rules</w:t>
+      </w:r>
+    </w:p>
+    <w:p>
+      <w:pPr>
+        <w:rPr>
+          <w:sz w:val="24"/>
+          <w:szCs w:val="24"/>
+          <w:lang w:val="en-GB"/>
+        </w:rPr>
+      </w:pPr>
+      <w:r>
+        <w:rPr>
+          <w:sz w:val="24"/>
+          <w:szCs w:val="24"/>
+          <w:lang w:val="en-GB"/>
+        </w:rPr>
+        <w:t>## Quiz</w:t>
       </w:r>
     </w:p>
     <w:p>
@@ -384,19 +2585,17 @@
         <w:pStyle w:val="ListParagraph"/>
         <w:numPr>
           <w:ilvl w:val="0"/>
-          <w:numId w:val="2"/>
-        </w:numPr>
-        <w:rPr>
-          <w:rFonts w:ascii="Fira Code" w:hAnsi="Fira Code" w:cs="Fira Code"/>
-          <w:lang w:val="en-GB"/>
-        </w:rPr>
-      </w:pPr>
-      <w:r>
-        <w:rPr>
-          <w:rFonts w:ascii="Fira Code" w:hAnsi="Fira Code" w:cs="Fira Code"/>
-          <w:lang w:val="en-GB"/>
-        </w:rPr>
-        <w:t>Build a question bank of 50 questions for each topic. These will be randomly used for each quiz.</w:t>
+          <w:numId w:val="4"/>
+        </w:numPr>
+        <w:rPr>
+          <w:lang w:val="en-GB"/>
+        </w:rPr>
+      </w:pPr>
+      <w:r>
+        <w:rPr>
+          <w:lang w:val="en-GB"/>
+        </w:rPr>
+        <w:t>generate questions using Algorithmic method</w:t>
       </w:r>
     </w:p>
     <w:p>
@@ -404,38 +2603,620 @@
         <w:pStyle w:val="ListParagraph"/>
         <w:numPr>
           <w:ilvl w:val="0"/>
-          <w:numId w:val="2"/>
-        </w:numPr>
-        <w:rPr>
-          <w:rFonts w:ascii="Fira Code" w:hAnsi="Fira Code" w:cs="Fira Code"/>
-          <w:lang w:val="en-GB"/>
-        </w:rPr>
-      </w:pPr>
-      <w:r>
-        <w:rPr>
-          <w:rFonts w:ascii="Fira Code" w:hAnsi="Fira Code" w:cs="Fira Code"/>
-          <w:lang w:val="en-GB"/>
-        </w:rPr>
-        <w:t>Keep refreshing the question bank with new questions</w:t>
-      </w:r>
-    </w:p>
-    <w:p>
-      <w:pPr>
-        <w:rPr>
-          <w:rFonts w:ascii="Fira Code" w:hAnsi="Fira Code" w:cs="Fira Code"/>
-          <w:lang w:val="en-GB"/>
-        </w:rPr>
-      </w:pPr>
-    </w:p>
-    <w:p>
-      <w:pPr>
-        <w:rPr>
-          <w:lang w:val="en-GB"/>
-        </w:rPr>
-      </w:pPr>
-      <w:r>
-        <w:rPr>
-          <w:rFonts w:ascii="Fira Code" w:hAnsi="Fira Code" w:cs="Fira Code"/>
+          <w:numId w:val="4"/>
+        </w:numPr>
+        <w:rPr>
+          <w:lang w:val="en-GB"/>
+        </w:rPr>
+      </w:pPr>
+      <w:r>
+        <w:rPr>
+          <w:lang w:val="en-GB"/>
+        </w:rPr>
+        <w:t>complexity of questions</w:t>
+      </w:r>
+    </w:p>
+    <w:p>
+      <w:pPr>
+        <w:pStyle w:val="ListParagraph"/>
+        <w:numPr>
+          <w:ilvl w:val="1"/>
+          <w:numId w:val="4"/>
+        </w:numPr>
+        <w:rPr>
+          <w:lang w:val="en-GB"/>
+        </w:rPr>
+      </w:pPr>
+      <w:r>
+        <w:rPr>
+          <w:lang w:val="en-GB"/>
+        </w:rPr>
+        <w:t>S</w:t>
+      </w:r>
+      <w:r>
+        <w:rPr>
+          <w:lang w:val="en-GB"/>
+        </w:rPr>
+        <w:t>imple – questions which uses small numbers</w:t>
+      </w:r>
+      <w:r>
+        <w:rPr>
+          <w:lang w:val="en-GB"/>
+        </w:rPr>
+        <w:t>. It doesn’t contain texts</w:t>
+      </w:r>
+    </w:p>
+    <w:p>
+      <w:pPr>
+        <w:pStyle w:val="ListParagraph"/>
+        <w:numPr>
+          <w:ilvl w:val="1"/>
+          <w:numId w:val="4"/>
+        </w:numPr>
+        <w:rPr>
+          <w:lang w:val="en-GB"/>
+        </w:rPr>
+      </w:pPr>
+      <w:r>
+        <w:rPr>
+          <w:lang w:val="en-GB"/>
+        </w:rPr>
+        <w:t>Medium – questions which require dealing with large numbers. Question can have 01 -02 lines of texts</w:t>
+      </w:r>
+    </w:p>
+    <w:p>
+      <w:pPr>
+        <w:pStyle w:val="ListParagraph"/>
+        <w:numPr>
+          <w:ilvl w:val="1"/>
+          <w:numId w:val="4"/>
+        </w:numPr>
+        <w:rPr>
+          <w:lang w:val="en-GB"/>
+        </w:rPr>
+      </w:pPr>
+      <w:r>
+        <w:rPr>
+          <w:lang w:val="en-GB"/>
+        </w:rPr>
+        <w:t>Complex – questions that require reading 3-4 lines of texts to understand the question, extract information and then solve.</w:t>
+      </w:r>
+    </w:p>
+    <w:p>
+      <w:pPr>
+        <w:rPr>
+          <w:sz w:val="24"/>
+          <w:szCs w:val="24"/>
+          <w:lang w:val="en-GB"/>
+        </w:rPr>
+      </w:pPr>
+      <w:r>
+        <w:rPr>
+          <w:sz w:val="24"/>
+          <w:szCs w:val="24"/>
+          <w:lang w:val="en-GB"/>
+        </w:rPr>
+        <w:t xml:space="preserve">## Mental </w:t>
+      </w:r>
+      <w:r>
+        <w:rPr>
+          <w:sz w:val="24"/>
+          <w:szCs w:val="24"/>
+          <w:lang w:val="en-GB"/>
+        </w:rPr>
+        <w:t>Maths</w:t>
+      </w:r>
+    </w:p>
+    <w:p>
+      <w:pPr>
+        <w:pStyle w:val="ListParagraph"/>
+        <w:numPr>
+          <w:ilvl w:val="0"/>
+          <w:numId w:val="7"/>
+        </w:numPr>
+        <w:rPr>
+          <w:lang w:val="en-GB"/>
+        </w:rPr>
+      </w:pPr>
+      <w:r>
+        <w:rPr>
+          <w:lang w:val="en-GB"/>
+        </w:rPr>
+        <w:t>Quiz will cover following topics</w:t>
+      </w:r>
+    </w:p>
+    <w:p>
+      <w:pPr>
+        <w:pStyle w:val="ListParagraph"/>
+        <w:numPr>
+          <w:ilvl w:val="1"/>
+          <w:numId w:val="7"/>
+        </w:numPr>
+        <w:rPr>
+          <w:lang w:val="en-GB"/>
+        </w:rPr>
+      </w:pPr>
+      <w:r>
+        <w:rPr>
+          <w:lang w:val="en-GB"/>
+        </w:rPr>
+        <w:t>Addition</w:t>
+      </w:r>
+      <w:r>
+        <w:rPr>
+          <w:lang w:val="en-GB"/>
+        </w:rPr>
+        <w:t xml:space="preserve"> of up to three numbers</w:t>
+      </w:r>
+      <w:r>
+        <w:rPr>
+          <w:lang w:val="en-GB"/>
+        </w:rPr>
+        <w:t xml:space="preserve"> (a &lt;20, b&lt;20, c&lt;20)</w:t>
+      </w:r>
+    </w:p>
+    <w:p>
+      <w:pPr>
+        <w:pStyle w:val="ListParagraph"/>
+        <w:numPr>
+          <w:ilvl w:val="1"/>
+          <w:numId w:val="7"/>
+        </w:numPr>
+        <w:rPr>
+          <w:lang w:val="en-GB"/>
+        </w:rPr>
+      </w:pPr>
+      <w:r>
+        <w:rPr>
+          <w:lang w:val="en-GB"/>
+        </w:rPr>
+        <w:t>Subtraction</w:t>
+      </w:r>
+      <w:r>
+        <w:rPr>
+          <w:lang w:val="en-GB"/>
+        </w:rPr>
+        <w:t xml:space="preserve"> </w:t>
+      </w:r>
+      <w:r>
+        <w:rPr>
+          <w:lang w:val="en-GB"/>
+        </w:rPr>
+        <w:t>(a&lt;50, b&lt;50)</w:t>
+      </w:r>
+    </w:p>
+    <w:p>
+      <w:pPr>
+        <w:pStyle w:val="ListParagraph"/>
+        <w:numPr>
+          <w:ilvl w:val="1"/>
+          <w:numId w:val="7"/>
+        </w:numPr>
+        <w:rPr>
+          <w:lang w:val="en-GB"/>
+        </w:rPr>
+      </w:pPr>
+      <w:r>
+        <w:rPr>
+          <w:lang w:val="en-GB"/>
+        </w:rPr>
+        <w:t>Multiplication</w:t>
+      </w:r>
+      <w:r>
+        <w:rPr>
+          <w:lang w:val="en-GB"/>
+        </w:rPr>
+        <w:t xml:space="preserve"> (a&lt;20, b&lt;20)</w:t>
+      </w:r>
+    </w:p>
+    <w:p>
+      <w:pPr>
+        <w:pStyle w:val="ListParagraph"/>
+        <w:numPr>
+          <w:ilvl w:val="1"/>
+          <w:numId w:val="7"/>
+        </w:numPr>
+        <w:rPr>
+          <w:lang w:val="en-GB"/>
+        </w:rPr>
+      </w:pPr>
+      <w:r>
+        <w:rPr>
+          <w:lang w:val="en-GB"/>
+        </w:rPr>
+        <w:t>Division</w:t>
+      </w:r>
+      <w:r>
+        <w:rPr>
+          <w:lang w:val="en-GB"/>
+        </w:rPr>
+        <w:t xml:space="preserve"> (a&lt; 300, b&lt;20)</w:t>
+      </w:r>
+    </w:p>
+    <w:p>
+      <w:pPr>
+        <w:pStyle w:val="ListParagraph"/>
+        <w:numPr>
+          <w:ilvl w:val="1"/>
+          <w:numId w:val="7"/>
+        </w:numPr>
+        <w:rPr>
+          <w:lang w:val="en-GB"/>
+        </w:rPr>
+      </w:pPr>
+      <w:r>
+        <w:rPr>
+          <w:lang w:val="en-GB"/>
+        </w:rPr>
+        <w:t>Divisibility Test</w:t>
+      </w:r>
+      <w:r>
+        <w:rPr>
+          <w:lang w:val="en-GB"/>
+        </w:rPr>
+        <w:t xml:space="preserve"> for number up to 300</w:t>
+      </w:r>
+    </w:p>
+    <w:p>
+      <w:pPr>
+        <w:pStyle w:val="ListParagraph"/>
+        <w:numPr>
+          <w:ilvl w:val="1"/>
+          <w:numId w:val="7"/>
+        </w:numPr>
+        <w:rPr>
+          <w:lang w:val="en-GB"/>
+        </w:rPr>
+      </w:pPr>
+      <w:r>
+        <w:rPr>
+          <w:lang w:val="en-GB"/>
+        </w:rPr>
+        <w:t>Even, Odd, Prime Numbers</w:t>
+      </w:r>
+      <w:r>
+        <w:rPr>
+          <w:lang w:val="en-GB"/>
+        </w:rPr>
+        <w:t xml:space="preserve"> up to 100</w:t>
+      </w:r>
+    </w:p>
+    <w:p>
+      <w:pPr>
+        <w:pStyle w:val="ListParagraph"/>
+        <w:numPr>
+          <w:ilvl w:val="1"/>
+          <w:numId w:val="7"/>
+        </w:numPr>
+        <w:rPr>
+          <w:lang w:val="en-GB"/>
+        </w:rPr>
+      </w:pPr>
+      <w:r>
+        <w:rPr>
+          <w:lang w:val="en-GB"/>
+        </w:rPr>
+        <w:t>Addition and Subtraction of Like Fractions</w:t>
+      </w:r>
+      <w:r>
+        <w:rPr>
+          <w:lang w:val="en-GB"/>
+        </w:rPr>
+        <w:t xml:space="preserve"> (numerator and denominator &lt; 20)</w:t>
+      </w:r>
+    </w:p>
+    <w:p>
+      <w:pPr>
+        <w:pStyle w:val="ListParagraph"/>
+        <w:numPr>
+          <w:ilvl w:val="1"/>
+          <w:numId w:val="7"/>
+        </w:numPr>
+        <w:rPr>
+          <w:lang w:val="en-GB"/>
+        </w:rPr>
+      </w:pPr>
+      <w:r>
+        <w:rPr>
+          <w:lang w:val="en-GB"/>
+        </w:rPr>
+        <w:t>Comparison of Fractions</w:t>
+      </w:r>
+      <w:r>
+        <w:rPr>
+          <w:lang w:val="en-GB"/>
+        </w:rPr>
+        <w:t xml:space="preserve"> </w:t>
+      </w:r>
+      <w:r>
+        <w:rPr>
+          <w:lang w:val="en-GB"/>
+        </w:rPr>
+        <w:t xml:space="preserve">(numerator and denominator &lt; </w:t>
+      </w:r>
+      <w:r>
+        <w:rPr>
+          <w:lang w:val="en-GB"/>
+        </w:rPr>
+        <w:t>15</w:t>
+      </w:r>
+      <w:r>
+        <w:rPr>
+          <w:lang w:val="en-GB"/>
+        </w:rPr>
+        <w:t>)</w:t>
+      </w:r>
+    </w:p>
+    <w:p>
+      <w:pPr>
+        <w:pStyle w:val="ListParagraph"/>
+        <w:numPr>
+          <w:ilvl w:val="1"/>
+          <w:numId w:val="7"/>
+        </w:numPr>
+        <w:rPr>
+          <w:lang w:val="en-GB"/>
+        </w:rPr>
+      </w:pPr>
+      <w:r>
+        <w:rPr>
+          <w:lang w:val="en-GB"/>
+        </w:rPr>
+        <w:t>Perimeter of Square, Rectangle and Triangle</w:t>
+      </w:r>
+      <w:r>
+        <w:rPr>
+          <w:lang w:val="en-GB"/>
+        </w:rPr>
+        <w:t xml:space="preserve"> (sides &lt; 20)</w:t>
+      </w:r>
+    </w:p>
+    <w:p>
+      <w:pPr>
+        <w:pStyle w:val="ListParagraph"/>
+        <w:numPr>
+          <w:ilvl w:val="1"/>
+          <w:numId w:val="7"/>
+        </w:numPr>
+        <w:rPr>
+          <w:lang w:val="en-GB"/>
+        </w:rPr>
+      </w:pPr>
+      <w:r>
+        <w:rPr>
+          <w:lang w:val="en-GB"/>
+        </w:rPr>
+        <w:t>Area of Square and Rectangle</w:t>
+      </w:r>
+      <w:r>
+        <w:rPr>
+          <w:lang w:val="en-GB"/>
+        </w:rPr>
+        <w:t xml:space="preserve"> (square sides &lt; 15, Rectangle &lt; 15)</w:t>
+      </w:r>
+    </w:p>
+    <w:p>
+      <w:pPr>
+        <w:pStyle w:val="ListParagraph"/>
+        <w:numPr>
+          <w:ilvl w:val="1"/>
+          <w:numId w:val="7"/>
+        </w:numPr>
+        <w:rPr>
+          <w:lang w:val="en-GB"/>
+        </w:rPr>
+      </w:pPr>
+      <w:r>
+        <w:rPr>
+          <w:lang w:val="en-GB"/>
+        </w:rPr>
+        <w:lastRenderedPageBreak/>
+        <w:t>Find Factors of a Number</w:t>
+      </w:r>
+      <w:r>
+        <w:rPr>
+          <w:lang w:val="en-GB"/>
+        </w:rPr>
+        <w:t xml:space="preserve"> (number &lt; 40)</w:t>
+      </w:r>
+    </w:p>
+    <w:p>
+      <w:pPr>
+        <w:pStyle w:val="ListParagraph"/>
+        <w:rPr>
+          <w:lang w:val="en-GB"/>
+        </w:rPr>
+      </w:pPr>
+    </w:p>
+    <w:p>
+      <w:pPr>
+        <w:rPr>
+          <w:lang w:val="en-GB"/>
+        </w:rPr>
+      </w:pPr>
+    </w:p>
+    <w:p>
+      <w:pPr>
+        <w:rPr>
+          <w:sz w:val="24"/>
+          <w:szCs w:val="24"/>
+          <w:lang w:val="en-GB"/>
+        </w:rPr>
+      </w:pPr>
+      <w:r>
+        <w:rPr>
+          <w:lang w:val="en-GB"/>
+        </w:rPr>
+        <w:t xml:space="preserve">## </w:t>
+      </w:r>
+      <w:r>
+        <w:rPr>
+          <w:sz w:val="24"/>
+          <w:szCs w:val="24"/>
+          <w:lang w:val="en-GB"/>
+        </w:rPr>
+        <w:t>Refresh</w:t>
+      </w:r>
+    </w:p>
+    <w:p>
+      <w:pPr>
+        <w:pStyle w:val="ListParagraph"/>
+        <w:numPr>
+          <w:ilvl w:val="0"/>
+          <w:numId w:val="5"/>
+        </w:numPr>
+        <w:rPr>
+          <w:lang w:val="en-GB"/>
+        </w:rPr>
+      </w:pPr>
+      <w:r>
+        <w:rPr>
+          <w:lang w:val="en-GB"/>
+        </w:rPr>
+        <w:t>Application scrapes internet to search relevant webpages on the sub-topic. It selects the Top 3 most visited webpage and stores the url along with date &amp; time</w:t>
+      </w:r>
+      <w:r>
+        <w:rPr>
+          <w:lang w:val="en-GB"/>
+        </w:rPr>
+        <w:t xml:space="preserve"> and name of sub-topic</w:t>
+      </w:r>
+      <w:r>
+        <w:rPr>
+          <w:lang w:val="en-GB"/>
+        </w:rPr>
+        <w:t>.</w:t>
+      </w:r>
+    </w:p>
+    <w:p>
+      <w:pPr>
+        <w:pStyle w:val="ListParagraph"/>
+        <w:numPr>
+          <w:ilvl w:val="0"/>
+          <w:numId w:val="5"/>
+        </w:numPr>
+        <w:rPr>
+          <w:lang w:val="en-GB"/>
+        </w:rPr>
+      </w:pPr>
+      <w:r>
+        <w:rPr>
+          <w:lang w:val="en-GB"/>
+        </w:rPr>
+        <w:t>Appli</w:t>
+      </w:r>
+      <w:r>
+        <w:rPr>
+          <w:lang w:val="en-GB"/>
+        </w:rPr>
+        <w:t>cation searches the sub-topic in YouTube and stores the url along with date &amp; time and name of sub-topic.</w:t>
+      </w:r>
+    </w:p>
+    <w:p>
+      <w:pPr>
+        <w:pStyle w:val="ListParagraph"/>
+        <w:numPr>
+          <w:ilvl w:val="0"/>
+          <w:numId w:val="5"/>
+        </w:numPr>
+        <w:rPr>
+          <w:lang w:val="en-GB"/>
+        </w:rPr>
+      </w:pPr>
+      <w:r>
+        <w:rPr>
+          <w:lang w:val="en-GB"/>
+        </w:rPr>
+        <w:t>Application first checks database before scraping or searching YouTube for each sub-topic.</w:t>
+      </w:r>
+    </w:p>
+    <w:p>
+      <w:pPr>
+        <w:pStyle w:val="ListParagraph"/>
+        <w:numPr>
+          <w:ilvl w:val="1"/>
+          <w:numId w:val="5"/>
+        </w:numPr>
+        <w:rPr>
+          <w:lang w:val="en-GB"/>
+        </w:rPr>
+      </w:pPr>
+      <w:r>
+        <w:rPr>
+          <w:lang w:val="en-GB"/>
+        </w:rPr>
+        <w:t>if urls of web pages and YouTube are available for a sub-topic then skip. Do not scrape the internet</w:t>
+      </w:r>
+      <w:r>
+        <w:rPr>
+          <w:lang w:val="en-GB"/>
+        </w:rPr>
+        <w:t xml:space="preserve"> or YouTube</w:t>
+      </w:r>
+      <w:r>
+        <w:rPr>
+          <w:lang w:val="en-GB"/>
+        </w:rPr>
+        <w:t xml:space="preserve"> for that sub-topic.</w:t>
+      </w:r>
+    </w:p>
+    <w:p>
+      <w:pPr>
+        <w:pStyle w:val="ListParagraph"/>
+        <w:numPr>
+          <w:ilvl w:val="1"/>
+          <w:numId w:val="5"/>
+        </w:numPr>
+        <w:rPr>
+          <w:lang w:val="en-GB"/>
+        </w:rPr>
+      </w:pPr>
+      <w:r>
+        <w:rPr>
+          <w:lang w:val="en-GB"/>
+        </w:rPr>
+        <w:t xml:space="preserve">if urls of web pages and YouTube are </w:t>
+      </w:r>
+      <w:r>
+        <w:rPr>
+          <w:lang w:val="en-GB"/>
+        </w:rPr>
+        <w:t xml:space="preserve">not </w:t>
+      </w:r>
+      <w:r>
+        <w:rPr>
+          <w:lang w:val="en-GB"/>
+        </w:rPr>
+        <w:t xml:space="preserve">available for a sub-topic then scrape the internet </w:t>
+      </w:r>
+      <w:r>
+        <w:rPr>
+          <w:lang w:val="en-GB"/>
+        </w:rPr>
+        <w:t xml:space="preserve">and YouTube </w:t>
+      </w:r>
+      <w:r>
+        <w:rPr>
+          <w:lang w:val="en-GB"/>
+        </w:rPr>
+        <w:t>for that sub-topic.</w:t>
+      </w:r>
+    </w:p>
+    <w:p>
+      <w:pPr>
+        <w:rPr>
+          <w:lang w:val="en-GB"/>
+        </w:rPr>
+      </w:pPr>
+    </w:p>
+    <w:p>
+      <w:pPr>
+        <w:rPr>
+          <w:lang w:val="en-GB"/>
+        </w:rPr>
+      </w:pPr>
+      <w:r>
+        <w:rPr>
           <w:lang w:val="en-GB"/>
         </w:rPr>
         <w:t>Suggest the tech stack to build this app to run on windows machine.</w:t>
@@ -482,8 +3263,121 @@
 <w:numbering xmlns:wpc="http://schemas.microsoft.com/office/word/2010/wordprocessingCanvas" xmlns:cx="http://schemas.microsoft.com/office/drawing/2014/chartex" xmlns:cx1="http://schemas.microsoft.com/office/drawing/2015/9/8/chartex" xmlns:cx2="http://schemas.microsoft.com/office/drawing/2015/10/21/chartex" xmlns:cx3="http://schemas.microsoft.com/office/drawing/2016/5/9/chartex" xmlns:cx4="http://schemas.microsoft.com/office/drawing/2016/5/10/chartex" xmlns:cx5="http://schemas.microsoft.com/office/drawing/2016/5/11/chartex" xmlns:cx6="http://schemas.microsoft.com/office/drawing/2016/5/12/chartex" xmlns:cx7="http://schemas.microsoft.com/office/drawing/2016/5/13/chartex" xmlns:cx8="http://schemas.microsoft.com/office/drawing/2016/5/14/chartex" xmlns:mc="http://schemas.openxmlformats.org/markup-compatibility/2006" xmlns:aink="http://schemas.microsoft.com/office/drawing/2016/ink" xmlns:am3d="http://schemas.microsoft.com/office/drawing/2017/model3d" xmlns:o="urn:schemas-microsoft-com:office:office" xmlns:oel="http://schemas.microsoft.com/office/2019/extlst" xmlns:r="http://schemas.openxmlformats.org/officeDocument/2006/relationships" xmlns:m="http://schemas.openxmlformats.org/officeDocument/2006/math" xmlns:v="urn:schemas-microsoft-com:vml" xmlns:wp14="http://schemas.microsoft.com/office/word/2010/wordprocessingDrawing" xmlns:wp="http://schemas.openxmlformats.org/drawingml/2006/wordprocessingDrawing" xmlns:w10="urn:schemas-microsoft-com:office:word" xmlns:w="http://schemas.openxmlformats.org/wordprocessingml/2006/main" xmlns:w14="http://schemas.microsoft.com/office/word/2010/wordml" xmlns:w15="http://schemas.microsoft.com/office/word/2012/wordml" xmlns:w16cex="http://schemas.microsoft.com/office/word/2018/wordml/cex" xmlns:w16cid="http://schemas.microsoft.com/office/word/2016/wordml/cid" xmlns:w16="http://schemas.microsoft.com/office/word/2018/wordml" xmlns:w16du="http://schemas.microsoft.com/office/word/2023/wordml/word16du" xmlns:w16sdtdh="http://schemas.microsoft.com/office/word/2020/wordml/sdtdatahash" xmlns:w16sdtfl="http://schemas.microsoft.com/office/word/2024/wordml/sdtformatlock" xmlns:w16se="http://schemas.microsoft.com/office/word/2015/wordml/symex" xmlns:wpg="http://schemas.microsoft.com/office/word/2010/wordprocessingGroup" xmlns:wpi="http://schemas.microsoft.com/office/word/2010/wordprocessingInk" xmlns:wne="http://schemas.microsoft.com/office/word/2006/wordml" xmlns:wps="http://schemas.microsoft.com/office/word/2010/wordprocessingShape" mc:Ignorable="w14 w15 w16se w16cid w16 w16cex w16sdtdh w16sdtfl w16du wp14">
   <w:abstractNum w:abstractNumId="0" w15:restartNumberingAfterBreak="0">
     <w:nsid w:val="374C1594"/>
+    <w:multiLevelType w:val="multilevel"/>
+    <w:tmpl w:val="4009001F"/>
+    <w:lvl w:ilvl="0">
+      <w:start w:val="1"/>
+      <w:numFmt w:val="decimal"/>
+      <w:lvlText w:val="%1."/>
+      <w:lvlJc w:val="left"/>
+      <w:pPr>
+        <w:ind w:left="360" w:hanging="360"/>
+      </w:pPr>
+      <w:rPr>
+        <w:rFonts w:hint="default"/>
+      </w:rPr>
+    </w:lvl>
+    <w:lvl w:ilvl="1">
+      <w:start w:val="1"/>
+      <w:numFmt w:val="decimal"/>
+      <w:lvlText w:val="%1.%2."/>
+      <w:lvlJc w:val="left"/>
+      <w:pPr>
+        <w:ind w:left="792" w:hanging="432"/>
+      </w:pPr>
+      <w:rPr>
+        <w:rFonts w:hint="default"/>
+      </w:rPr>
+    </w:lvl>
+    <w:lvl w:ilvl="2">
+      <w:start w:val="1"/>
+      <w:numFmt w:val="decimal"/>
+      <w:lvlText w:val="%1.%2.%3."/>
+      <w:lvlJc w:val="left"/>
+      <w:pPr>
+        <w:ind w:left="1224" w:hanging="504"/>
+      </w:pPr>
+      <w:rPr>
+        <w:rFonts w:hint="default"/>
+      </w:rPr>
+    </w:lvl>
+    <w:lvl w:ilvl="3">
+      <w:start w:val="1"/>
+      <w:numFmt w:val="decimal"/>
+      <w:lvlText w:val="%1.%2.%3.%4."/>
+      <w:lvlJc w:val="left"/>
+      <w:pPr>
+        <w:ind w:left="1728" w:hanging="648"/>
+      </w:pPr>
+      <w:rPr>
+        <w:rFonts w:hint="default"/>
+      </w:rPr>
+    </w:lvl>
+    <w:lvl w:ilvl="4">
+      <w:start w:val="1"/>
+      <w:numFmt w:val="decimal"/>
+      <w:lvlText w:val="%1.%2.%3.%4.%5."/>
+      <w:lvlJc w:val="left"/>
+      <w:pPr>
+        <w:ind w:left="2232" w:hanging="792"/>
+      </w:pPr>
+      <w:rPr>
+        <w:rFonts w:hint="default"/>
+      </w:rPr>
+    </w:lvl>
+    <w:lvl w:ilvl="5">
+      <w:start w:val="1"/>
+      <w:numFmt w:val="decimal"/>
+      <w:lvlText w:val="%1.%2.%3.%4.%5.%6."/>
+      <w:lvlJc w:val="left"/>
+      <w:pPr>
+        <w:ind w:left="2736" w:hanging="936"/>
+      </w:pPr>
+      <w:rPr>
+        <w:rFonts w:hint="default"/>
+      </w:rPr>
+    </w:lvl>
+    <w:lvl w:ilvl="6">
+      <w:start w:val="1"/>
+      <w:numFmt w:val="decimal"/>
+      <w:lvlText w:val="%1.%2.%3.%4.%5.%6.%7."/>
+      <w:lvlJc w:val="left"/>
+      <w:pPr>
+        <w:ind w:left="3240" w:hanging="1080"/>
+      </w:pPr>
+      <w:rPr>
+        <w:rFonts w:hint="default"/>
+      </w:rPr>
+    </w:lvl>
+    <w:lvl w:ilvl="7">
+      <w:start w:val="1"/>
+      <w:numFmt w:val="decimal"/>
+      <w:lvlText w:val="%1.%2.%3.%4.%5.%6.%7.%8."/>
+      <w:lvlJc w:val="left"/>
+      <w:pPr>
+        <w:ind w:left="3744" w:hanging="1224"/>
+      </w:pPr>
+      <w:rPr>
+        <w:rFonts w:hint="default"/>
+      </w:rPr>
+    </w:lvl>
+    <w:lvl w:ilvl="8">
+      <w:start w:val="1"/>
+      <w:numFmt w:val="decimal"/>
+      <w:lvlText w:val="%1.%2.%3.%4.%5.%6.%7.%8.%9."/>
+      <w:lvlJc w:val="left"/>
+      <w:pPr>
+        <w:ind w:left="4320" w:hanging="1440"/>
+      </w:pPr>
+      <w:rPr>
+        <w:rFonts w:hint="default"/>
+      </w:rPr>
+    </w:lvl>
+  </w:abstractNum>
+  <w:abstractNum w:abstractNumId="1" w15:restartNumberingAfterBreak="0">
+    <w:nsid w:val="443E4721"/>
     <w:multiLevelType w:val="hybridMultilevel"/>
-    <w:tmpl w:val="1134716E"/>
+    <w:tmpl w:val="F3349830"/>
     <w:lvl w:ilvl="0" w:tplc="40090001">
       <w:start w:val="1"/>
       <w:numFmt w:val="bullet"/>
@@ -496,7 +3390,7 @@
         <w:rFonts w:ascii="Symbol" w:hAnsi="Symbol" w:hint="default"/>
       </w:rPr>
     </w:lvl>
-    <w:lvl w:ilvl="1" w:tplc="40090003" w:tentative="1">
+    <w:lvl w:ilvl="1" w:tplc="40090003">
       <w:start w:val="1"/>
       <w:numFmt w:val="bullet"/>
       <w:lvlText w:val="o"/>
@@ -593,7 +3487,233 @@
       </w:rPr>
     </w:lvl>
   </w:abstractNum>
-  <w:abstractNum w:abstractNumId="1" w15:restartNumberingAfterBreak="0">
+  <w:abstractNum w:abstractNumId="2" w15:restartNumberingAfterBreak="0">
+    <w:nsid w:val="45BD2633"/>
+    <w:multiLevelType w:val="hybridMultilevel"/>
+    <w:tmpl w:val="7B922E44"/>
+    <w:lvl w:ilvl="0" w:tplc="40090001">
+      <w:start w:val="1"/>
+      <w:numFmt w:val="bullet"/>
+      <w:lvlText w:val=""/>
+      <w:lvlJc w:val="left"/>
+      <w:pPr>
+        <w:ind w:left="720" w:hanging="360"/>
+      </w:pPr>
+      <w:rPr>
+        <w:rFonts w:ascii="Symbol" w:hAnsi="Symbol" w:hint="default"/>
+      </w:rPr>
+    </w:lvl>
+    <w:lvl w:ilvl="1" w:tplc="40090003" w:tentative="1">
+      <w:start w:val="1"/>
+      <w:numFmt w:val="bullet"/>
+      <w:lvlText w:val="o"/>
+      <w:lvlJc w:val="left"/>
+      <w:pPr>
+        <w:ind w:left="1440" w:hanging="360"/>
+      </w:pPr>
+      <w:rPr>
+        <w:rFonts w:ascii="Courier New" w:hAnsi="Courier New" w:cs="Courier New" w:hint="default"/>
+      </w:rPr>
+    </w:lvl>
+    <w:lvl w:ilvl="2" w:tplc="40090005" w:tentative="1">
+      <w:start w:val="1"/>
+      <w:numFmt w:val="bullet"/>
+      <w:lvlText w:val=""/>
+      <w:lvlJc w:val="left"/>
+      <w:pPr>
+        <w:ind w:left="2160" w:hanging="360"/>
+      </w:pPr>
+      <w:rPr>
+        <w:rFonts w:ascii="Wingdings" w:hAnsi="Wingdings" w:hint="default"/>
+      </w:rPr>
+    </w:lvl>
+    <w:lvl w:ilvl="3" w:tplc="40090001" w:tentative="1">
+      <w:start w:val="1"/>
+      <w:numFmt w:val="bullet"/>
+      <w:lvlText w:val=""/>
+      <w:lvlJc w:val="left"/>
+      <w:pPr>
+        <w:ind w:left="2880" w:hanging="360"/>
+      </w:pPr>
+      <w:rPr>
+        <w:rFonts w:ascii="Symbol" w:hAnsi="Symbol" w:hint="default"/>
+      </w:rPr>
+    </w:lvl>
+    <w:lvl w:ilvl="4" w:tplc="40090003" w:tentative="1">
+      <w:start w:val="1"/>
+      <w:numFmt w:val="bullet"/>
+      <w:lvlText w:val="o"/>
+      <w:lvlJc w:val="left"/>
+      <w:pPr>
+        <w:ind w:left="3600" w:hanging="360"/>
+      </w:pPr>
+      <w:rPr>
+        <w:rFonts w:ascii="Courier New" w:hAnsi="Courier New" w:cs="Courier New" w:hint="default"/>
+      </w:rPr>
+    </w:lvl>
+    <w:lvl w:ilvl="5" w:tplc="40090005" w:tentative="1">
+      <w:start w:val="1"/>
+      <w:numFmt w:val="bullet"/>
+      <w:lvlText w:val=""/>
+      <w:lvlJc w:val="left"/>
+      <w:pPr>
+        <w:ind w:left="4320" w:hanging="360"/>
+      </w:pPr>
+      <w:rPr>
+        <w:rFonts w:ascii="Wingdings" w:hAnsi="Wingdings" w:hint="default"/>
+      </w:rPr>
+    </w:lvl>
+    <w:lvl w:ilvl="6" w:tplc="40090001" w:tentative="1">
+      <w:start w:val="1"/>
+      <w:numFmt w:val="bullet"/>
+      <w:lvlText w:val=""/>
+      <w:lvlJc w:val="left"/>
+      <w:pPr>
+        <w:ind w:left="5040" w:hanging="360"/>
+      </w:pPr>
+      <w:rPr>
+        <w:rFonts w:ascii="Symbol" w:hAnsi="Symbol" w:hint="default"/>
+      </w:rPr>
+    </w:lvl>
+    <w:lvl w:ilvl="7" w:tplc="40090003" w:tentative="1">
+      <w:start w:val="1"/>
+      <w:numFmt w:val="bullet"/>
+      <w:lvlText w:val="o"/>
+      <w:lvlJc w:val="left"/>
+      <w:pPr>
+        <w:ind w:left="5760" w:hanging="360"/>
+      </w:pPr>
+      <w:rPr>
+        <w:rFonts w:ascii="Courier New" w:hAnsi="Courier New" w:cs="Courier New" w:hint="default"/>
+      </w:rPr>
+    </w:lvl>
+    <w:lvl w:ilvl="8" w:tplc="40090005" w:tentative="1">
+      <w:start w:val="1"/>
+      <w:numFmt w:val="bullet"/>
+      <w:lvlText w:val=""/>
+      <w:lvlJc w:val="left"/>
+      <w:pPr>
+        <w:ind w:left="6480" w:hanging="360"/>
+      </w:pPr>
+      <w:rPr>
+        <w:rFonts w:ascii="Wingdings" w:hAnsi="Wingdings" w:hint="default"/>
+      </w:rPr>
+    </w:lvl>
+  </w:abstractNum>
+  <w:abstractNum w:abstractNumId="3" w15:restartNumberingAfterBreak="0">
+    <w:nsid w:val="4C8C5AEE"/>
+    <w:multiLevelType w:val="hybridMultilevel"/>
+    <w:tmpl w:val="68F85D58"/>
+    <w:lvl w:ilvl="0" w:tplc="40090001">
+      <w:start w:val="1"/>
+      <w:numFmt w:val="bullet"/>
+      <w:lvlText w:val=""/>
+      <w:lvlJc w:val="left"/>
+      <w:pPr>
+        <w:ind w:left="720" w:hanging="360"/>
+      </w:pPr>
+      <w:rPr>
+        <w:rFonts w:ascii="Symbol" w:hAnsi="Symbol" w:hint="default"/>
+      </w:rPr>
+    </w:lvl>
+    <w:lvl w:ilvl="1" w:tplc="40090003">
+      <w:start w:val="1"/>
+      <w:numFmt w:val="bullet"/>
+      <w:lvlText w:val="o"/>
+      <w:lvlJc w:val="left"/>
+      <w:pPr>
+        <w:ind w:left="1440" w:hanging="360"/>
+      </w:pPr>
+      <w:rPr>
+        <w:rFonts w:ascii="Courier New" w:hAnsi="Courier New" w:cs="Courier New" w:hint="default"/>
+      </w:rPr>
+    </w:lvl>
+    <w:lvl w:ilvl="2" w:tplc="40090005" w:tentative="1">
+      <w:start w:val="1"/>
+      <w:numFmt w:val="bullet"/>
+      <w:lvlText w:val=""/>
+      <w:lvlJc w:val="left"/>
+      <w:pPr>
+        <w:ind w:left="2160" w:hanging="360"/>
+      </w:pPr>
+      <w:rPr>
+        <w:rFonts w:ascii="Wingdings" w:hAnsi="Wingdings" w:hint="default"/>
+      </w:rPr>
+    </w:lvl>
+    <w:lvl w:ilvl="3" w:tplc="40090001" w:tentative="1">
+      <w:start w:val="1"/>
+      <w:numFmt w:val="bullet"/>
+      <w:lvlText w:val=""/>
+      <w:lvlJc w:val="left"/>
+      <w:pPr>
+        <w:ind w:left="2880" w:hanging="360"/>
+      </w:pPr>
+      <w:rPr>
+        <w:rFonts w:ascii="Symbol" w:hAnsi="Symbol" w:hint="default"/>
+      </w:rPr>
+    </w:lvl>
+    <w:lvl w:ilvl="4" w:tplc="40090003" w:tentative="1">
+      <w:start w:val="1"/>
+      <w:numFmt w:val="bullet"/>
+      <w:lvlText w:val="o"/>
+      <w:lvlJc w:val="left"/>
+      <w:pPr>
+        <w:ind w:left="3600" w:hanging="360"/>
+      </w:pPr>
+      <w:rPr>
+        <w:rFonts w:ascii="Courier New" w:hAnsi="Courier New" w:cs="Courier New" w:hint="default"/>
+      </w:rPr>
+    </w:lvl>
+    <w:lvl w:ilvl="5" w:tplc="40090005" w:tentative="1">
+      <w:start w:val="1"/>
+      <w:numFmt w:val="bullet"/>
+      <w:lvlText w:val=""/>
+      <w:lvlJc w:val="left"/>
+      <w:pPr>
+        <w:ind w:left="4320" w:hanging="360"/>
+      </w:pPr>
+      <w:rPr>
+        <w:rFonts w:ascii="Wingdings" w:hAnsi="Wingdings" w:hint="default"/>
+      </w:rPr>
+    </w:lvl>
+    <w:lvl w:ilvl="6" w:tplc="40090001" w:tentative="1">
+      <w:start w:val="1"/>
+      <w:numFmt w:val="bullet"/>
+      <w:lvlText w:val=""/>
+      <w:lvlJc w:val="left"/>
+      <w:pPr>
+        <w:ind w:left="5040" w:hanging="360"/>
+      </w:pPr>
+      <w:rPr>
+        <w:rFonts w:ascii="Symbol" w:hAnsi="Symbol" w:hint="default"/>
+      </w:rPr>
+    </w:lvl>
+    <w:lvl w:ilvl="7" w:tplc="40090003" w:tentative="1">
+      <w:start w:val="1"/>
+      <w:numFmt w:val="bullet"/>
+      <w:lvlText w:val="o"/>
+      <w:lvlJc w:val="left"/>
+      <w:pPr>
+        <w:ind w:left="5760" w:hanging="360"/>
+      </w:pPr>
+      <w:rPr>
+        <w:rFonts w:ascii="Courier New" w:hAnsi="Courier New" w:cs="Courier New" w:hint="default"/>
+      </w:rPr>
+    </w:lvl>
+    <w:lvl w:ilvl="8" w:tplc="40090005" w:tentative="1">
+      <w:start w:val="1"/>
+      <w:numFmt w:val="bullet"/>
+      <w:lvlText w:val=""/>
+      <w:lvlJc w:val="left"/>
+      <w:pPr>
+        <w:ind w:left="6480" w:hanging="360"/>
+      </w:pPr>
+      <w:rPr>
+        <w:rFonts w:ascii="Wingdings" w:hAnsi="Wingdings" w:hint="default"/>
+      </w:rPr>
+    </w:lvl>
+  </w:abstractNum>
+  <w:abstractNum w:abstractNumId="4" w15:restartNumberingAfterBreak="0">
     <w:nsid w:val="567E60A7"/>
     <w:multiLevelType w:val="hybridMultilevel"/>
     <w:tmpl w:val="84CE3BE0"/>
@@ -609,7 +3729,7 @@
         <w:rFonts w:ascii="Symbol" w:hAnsi="Symbol" w:hint="default"/>
       </w:rPr>
     </w:lvl>
-    <w:lvl w:ilvl="1" w:tplc="40090003" w:tentative="1">
+    <w:lvl w:ilvl="1" w:tplc="40090003">
       <w:start w:val="1"/>
       <w:numFmt w:val="bullet"/>
       <w:lvlText w:val="o"/>
@@ -621,7 +3741,7 @@
         <w:rFonts w:ascii="Courier New" w:hAnsi="Courier New" w:cs="Courier New" w:hint="default"/>
       </w:rPr>
     </w:lvl>
-    <w:lvl w:ilvl="2" w:tplc="40090005" w:tentative="1">
+    <w:lvl w:ilvl="2" w:tplc="40090005">
       <w:start w:val="1"/>
       <w:numFmt w:val="bullet"/>
       <w:lvlText w:val=""/>
@@ -633,7 +3753,7 @@
         <w:rFonts w:ascii="Wingdings" w:hAnsi="Wingdings" w:hint="default"/>
       </w:rPr>
     </w:lvl>
-    <w:lvl w:ilvl="3" w:tplc="40090001" w:tentative="1">
+    <w:lvl w:ilvl="3" w:tplc="40090001">
       <w:start w:val="1"/>
       <w:numFmt w:val="bullet"/>
       <w:lvlText w:val=""/>
@@ -706,7 +3826,120 @@
       </w:rPr>
     </w:lvl>
   </w:abstractNum>
-  <w:abstractNum w:abstractNumId="2" w15:restartNumberingAfterBreak="0">
+  <w:abstractNum w:abstractNumId="5" w15:restartNumberingAfterBreak="0">
+    <w:nsid w:val="6A620044"/>
+    <w:multiLevelType w:val="hybridMultilevel"/>
+    <w:tmpl w:val="B456FB02"/>
+    <w:lvl w:ilvl="0" w:tplc="40090001">
+      <w:start w:val="1"/>
+      <w:numFmt w:val="bullet"/>
+      <w:lvlText w:val=""/>
+      <w:lvlJc w:val="left"/>
+      <w:pPr>
+        <w:ind w:left="720" w:hanging="360"/>
+      </w:pPr>
+      <w:rPr>
+        <w:rFonts w:ascii="Symbol" w:hAnsi="Symbol" w:hint="default"/>
+      </w:rPr>
+    </w:lvl>
+    <w:lvl w:ilvl="1" w:tplc="40090003">
+      <w:start w:val="1"/>
+      <w:numFmt w:val="bullet"/>
+      <w:lvlText w:val="o"/>
+      <w:lvlJc w:val="left"/>
+      <w:pPr>
+        <w:ind w:left="1440" w:hanging="360"/>
+      </w:pPr>
+      <w:rPr>
+        <w:rFonts w:ascii="Courier New" w:hAnsi="Courier New" w:cs="Courier New" w:hint="default"/>
+      </w:rPr>
+    </w:lvl>
+    <w:lvl w:ilvl="2" w:tplc="40090005" w:tentative="1">
+      <w:start w:val="1"/>
+      <w:numFmt w:val="bullet"/>
+      <w:lvlText w:val=""/>
+      <w:lvlJc w:val="left"/>
+      <w:pPr>
+        <w:ind w:left="2160" w:hanging="360"/>
+      </w:pPr>
+      <w:rPr>
+        <w:rFonts w:ascii="Wingdings" w:hAnsi="Wingdings" w:hint="default"/>
+      </w:rPr>
+    </w:lvl>
+    <w:lvl w:ilvl="3" w:tplc="40090001" w:tentative="1">
+      <w:start w:val="1"/>
+      <w:numFmt w:val="bullet"/>
+      <w:lvlText w:val=""/>
+      <w:lvlJc w:val="left"/>
+      <w:pPr>
+        <w:ind w:left="2880" w:hanging="360"/>
+      </w:pPr>
+      <w:rPr>
+        <w:rFonts w:ascii="Symbol" w:hAnsi="Symbol" w:hint="default"/>
+      </w:rPr>
+    </w:lvl>
+    <w:lvl w:ilvl="4" w:tplc="40090003" w:tentative="1">
+      <w:start w:val="1"/>
+      <w:numFmt w:val="bullet"/>
+      <w:lvlText w:val="o"/>
+      <w:lvlJc w:val="left"/>
+      <w:pPr>
+        <w:ind w:left="3600" w:hanging="360"/>
+      </w:pPr>
+      <w:rPr>
+        <w:rFonts w:ascii="Courier New" w:hAnsi="Courier New" w:cs="Courier New" w:hint="default"/>
+      </w:rPr>
+    </w:lvl>
+    <w:lvl w:ilvl="5" w:tplc="40090005" w:tentative="1">
+      <w:start w:val="1"/>
+      <w:numFmt w:val="bullet"/>
+      <w:lvlText w:val=""/>
+      <w:lvlJc w:val="left"/>
+      <w:pPr>
+        <w:ind w:left="4320" w:hanging="360"/>
+      </w:pPr>
+      <w:rPr>
+        <w:rFonts w:ascii="Wingdings" w:hAnsi="Wingdings" w:hint="default"/>
+      </w:rPr>
+    </w:lvl>
+    <w:lvl w:ilvl="6" w:tplc="40090001" w:tentative="1">
+      <w:start w:val="1"/>
+      <w:numFmt w:val="bullet"/>
+      <w:lvlText w:val=""/>
+      <w:lvlJc w:val="left"/>
+      <w:pPr>
+        <w:ind w:left="5040" w:hanging="360"/>
+      </w:pPr>
+      <w:rPr>
+        <w:rFonts w:ascii="Symbol" w:hAnsi="Symbol" w:hint="default"/>
+      </w:rPr>
+    </w:lvl>
+    <w:lvl w:ilvl="7" w:tplc="40090003" w:tentative="1">
+      <w:start w:val="1"/>
+      <w:numFmt w:val="bullet"/>
+      <w:lvlText w:val="o"/>
+      <w:lvlJc w:val="left"/>
+      <w:pPr>
+        <w:ind w:left="5760" w:hanging="360"/>
+      </w:pPr>
+      <w:rPr>
+        <w:rFonts w:ascii="Courier New" w:hAnsi="Courier New" w:cs="Courier New" w:hint="default"/>
+      </w:rPr>
+    </w:lvl>
+    <w:lvl w:ilvl="8" w:tplc="40090005" w:tentative="1">
+      <w:start w:val="1"/>
+      <w:numFmt w:val="bullet"/>
+      <w:lvlText w:val=""/>
+      <w:lvlJc w:val="left"/>
+      <w:pPr>
+        <w:ind w:left="6480" w:hanging="360"/>
+      </w:pPr>
+      <w:rPr>
+        <w:rFonts w:ascii="Wingdings" w:hAnsi="Wingdings" w:hint="default"/>
+      </w:rPr>
+    </w:lvl>
+  </w:abstractNum>
+  <w:abstractNum w:abstractNumId="6" w15:restartNumberingAfterBreak="0">
     <w:nsid w:val="6ED41A9C"/>
     <w:multiLevelType w:val="hybridMultilevel"/>
     <w:tmpl w:val="88B60D70"/>
@@ -796,13 +4029,25 @@
     </w:lvl>
   </w:abstractNum>
   <w:num w:numId="1" w16cid:durableId="1394229550">
-    <w:abstractNumId w:val="2"/>
+    <w:abstractNumId w:val="6"/>
   </w:num>
   <w:num w:numId="2" w16cid:durableId="656567942">
-    <w:abstractNumId w:val="1"/>
+    <w:abstractNumId w:val="4"/>
   </w:num>
   <w:num w:numId="3" w16cid:durableId="657850875">
     <w:abstractNumId w:val="0"/>
+  </w:num>
+  <w:num w:numId="4" w16cid:durableId="85881028">
+    <w:abstractNumId w:val="5"/>
+  </w:num>
+  <w:num w:numId="5" w16cid:durableId="1842967244">
+    <w:abstractNumId w:val="3"/>
+  </w:num>
+  <w:num w:numId="6" w16cid:durableId="1138453529">
+    <w:abstractNumId w:val="2"/>
+  </w:num>
+  <w:num w:numId="7" w16cid:durableId="530457540">
+    <w:abstractNumId w:val="1"/>
   </w:num>
 </w:numbering>
 </file>
@@ -812,7 +4057,7 @@
   <w:docDefaults>
     <w:rPrDefault>
       <w:rPr>
-        <w:rFonts w:ascii="JetBrains Mono" w:eastAsiaTheme="minorHAnsi" w:hAnsi="JetBrains Mono" w:cs="Arial"/>
+        <w:rFonts w:ascii="Andika" w:eastAsiaTheme="minorHAnsi" w:hAnsi="Andika" w:cs="Andika"/>
         <w:color w:val="595959" w:themeColor="text1" w:themeTint="A6"/>
         <w:kern w:val="2"/>
         <w:sz w:val="22"/>

</xml_diff>